<commit_message>
Fix ploblem with '&' in CV module
</commit_message>
<xml_diff>
--- a/src/assets/schema.docx
+++ b/src/assets/schema.docx
@@ -204,7 +204,29 @@
                       <w:sz w:val="16"/>
                       <w:szCs w:val="16"/>
                     </w:rPr>
-                    <w:t>{{title_header}}</w:t>
+                    <w:t>{{</w:t>
+                  </w:r>
+                  <w:proofErr w:type="spellStart"/>
+                  <w:r>
+                    <w:rPr>
+                      <w:rFonts w:ascii="Segoe UI" w:eastAsia="Segoe UI" w:hAnsi="Segoe UI" w:cs="Segoe UI"/>
+                      <w:b/>
+                      <w:color w:val="000000"/>
+                      <w:sz w:val="16"/>
+                      <w:szCs w:val="16"/>
+                    </w:rPr>
+                    <w:t>title_header</w:t>
+                  </w:r>
+                  <w:proofErr w:type="spellEnd"/>
+                  <w:r>
+                    <w:rPr>
+                      <w:rFonts w:ascii="Segoe UI" w:eastAsia="Segoe UI" w:hAnsi="Segoe UI" w:cs="Segoe UI"/>
+                      <w:b/>
+                      <w:color w:val="000000"/>
+                      <w:sz w:val="16"/>
+                      <w:szCs w:val="16"/>
+                    </w:rPr>
+                    <w:t>}}</w:t>
                   </w:r>
                   <w:r>
                     <w:rPr>
@@ -526,7 +548,25 @@
                       <w:sz w:val="16"/>
                       <w:szCs w:val="16"/>
                     </w:rPr>
-                    <w:t>{{ data[“item”]</w:t>
+                    <w:t>{{ data[“</w:t>
+                  </w:r>
+                  <w:proofErr w:type="spellStart"/>
+                  <w:r>
+                    <w:rPr>
+                      <w:rFonts w:ascii="Segoe UI" w:hAnsi="Segoe UI" w:cs="Segoe UI"/>
+                      <w:sz w:val="16"/>
+                      <w:szCs w:val="16"/>
+                    </w:rPr>
+                    <w:t>item</w:t>
+                  </w:r>
+                  <w:proofErr w:type="spellEnd"/>
+                  <w:r>
+                    <w:rPr>
+                      <w:rFonts w:ascii="Segoe UI" w:hAnsi="Segoe UI" w:cs="Segoe UI"/>
+                      <w:sz w:val="16"/>
+                      <w:szCs w:val="16"/>
+                    </w:rPr>
+                    <w:t>”]</w:t>
                   </w:r>
                   <w:r>
                     <w:rPr>
@@ -534,7 +574,25 @@
                       <w:sz w:val="16"/>
                       <w:szCs w:val="16"/>
                     </w:rPr>
-                    <w:t>.upper()</w:t>
+                    <w:t>.</w:t>
+                  </w:r>
+                  <w:proofErr w:type="spellStart"/>
+                  <w:r>
+                    <w:rPr>
+                      <w:rFonts w:ascii="Segoe UI" w:hAnsi="Segoe UI" w:cs="Segoe UI"/>
+                      <w:sz w:val="16"/>
+                      <w:szCs w:val="16"/>
+                    </w:rPr>
+                    <w:t>upper</w:t>
+                  </w:r>
+                  <w:proofErr w:type="spellEnd"/>
+                  <w:r>
+                    <w:rPr>
+                      <w:rFonts w:ascii="Segoe UI" w:hAnsi="Segoe UI" w:cs="Segoe UI"/>
+                      <w:sz w:val="16"/>
+                      <w:szCs w:val="16"/>
+                    </w:rPr>
+                    <w:t>()</w:t>
                   </w:r>
                   <w:r>
                     <w:rPr>
@@ -580,6 +638,7 @@
                     </w:rPr>
                     <w:t>{{ data[“</w:t>
                   </w:r>
+                  <w:proofErr w:type="spellStart"/>
                   <w:r>
                     <w:rPr>
                       <w:rFonts w:ascii="Segoe UI" w:hAnsi="Segoe UI" w:cs="Segoe UI"/>
@@ -588,6 +647,7 @@
                     </w:rPr>
                     <w:t>description</w:t>
                   </w:r>
+                  <w:proofErr w:type="spellEnd"/>
                   <w:r>
                     <w:rPr>
                       <w:rFonts w:ascii="Segoe UI" w:hAnsi="Segoe UI" w:cs="Segoe UI"/>
@@ -602,7 +662,25 @@
                       <w:sz w:val="16"/>
                       <w:szCs w:val="16"/>
                     </w:rPr>
-                    <w:t xml:space="preserve">.upper() </w:t>
+                    <w:t>.</w:t>
+                  </w:r>
+                  <w:proofErr w:type="spellStart"/>
+                  <w:r>
+                    <w:rPr>
+                      <w:rFonts w:ascii="Segoe UI" w:hAnsi="Segoe UI" w:cs="Segoe UI"/>
+                      <w:sz w:val="16"/>
+                      <w:szCs w:val="16"/>
+                    </w:rPr>
+                    <w:t>upper</w:t>
+                  </w:r>
+                  <w:proofErr w:type="spellEnd"/>
+                  <w:r>
+                    <w:rPr>
+                      <w:rFonts w:ascii="Segoe UI" w:hAnsi="Segoe UI" w:cs="Segoe UI"/>
+                      <w:sz w:val="16"/>
+                      <w:szCs w:val="16"/>
+                    </w:rPr>
+                    <w:t xml:space="preserve">() </w:t>
                   </w:r>
                   <w:r>
                     <w:rPr>
@@ -640,6 +718,7 @@
                     </w:rPr>
                     <w:t>{{ data[“</w:t>
                   </w:r>
+                  <w:proofErr w:type="spellStart"/>
                   <w:r>
                     <w:rPr>
                       <w:rFonts w:ascii="Segoe UI" w:hAnsi="Segoe UI" w:cs="Segoe UI"/>
@@ -648,6 +727,7 @@
                     </w:rPr>
                     <w:t>send_date</w:t>
                   </w:r>
+                  <w:proofErr w:type="spellEnd"/>
                   <w:r>
                     <w:rPr>
                       <w:rFonts w:ascii="Segoe UI" w:hAnsi="Segoe UI" w:cs="Segoe UI"/>
@@ -701,6 +781,7 @@
                     </w:rPr>
                     <w:t>{{ data[“</w:t>
                   </w:r>
+                  <w:proofErr w:type="spellStart"/>
                   <w:r>
                     <w:rPr>
                       <w:rFonts w:ascii="Segoe UI" w:hAnsi="Segoe UI" w:cs="Segoe UI"/>
@@ -709,6 +790,7 @@
                     </w:rPr>
                     <w:t>quantity</w:t>
                   </w:r>
+                  <w:proofErr w:type="spellEnd"/>
                   <w:r>
                     <w:rPr>
                       <w:rFonts w:ascii="Segoe UI" w:hAnsi="Segoe UI" w:cs="Segoe UI"/>
@@ -762,6 +844,7 @@
                     </w:rPr>
                     <w:t>{{ data[“</w:t>
                   </w:r>
+                  <w:proofErr w:type="spellStart"/>
                   <w:r>
                     <w:rPr>
                       <w:rFonts w:ascii="Segoe UI" w:hAnsi="Segoe UI" w:cs="Segoe UI"/>
@@ -770,6 +853,7 @@
                     </w:rPr>
                     <w:t>unit</w:t>
                   </w:r>
+                  <w:proofErr w:type="spellEnd"/>
                   <w:r>
                     <w:rPr>
                       <w:rFonts w:ascii="Segoe UI" w:hAnsi="Segoe UI" w:cs="Segoe UI"/>
@@ -784,7 +868,25 @@
                       <w:sz w:val="16"/>
                       <w:szCs w:val="16"/>
                     </w:rPr>
-                    <w:t xml:space="preserve"> .upper()</w:t>
+                    <w:t xml:space="preserve"> .</w:t>
+                  </w:r>
+                  <w:proofErr w:type="spellStart"/>
+                  <w:r>
+                    <w:rPr>
+                      <w:rFonts w:ascii="Segoe UI" w:hAnsi="Segoe UI" w:cs="Segoe UI"/>
+                      <w:sz w:val="16"/>
+                      <w:szCs w:val="16"/>
+                    </w:rPr>
+                    <w:t>upper</w:t>
+                  </w:r>
+                  <w:proofErr w:type="spellEnd"/>
+                  <w:r>
+                    <w:rPr>
+                      <w:rFonts w:ascii="Segoe UI" w:hAnsi="Segoe UI" w:cs="Segoe UI"/>
+                      <w:sz w:val="16"/>
+                      <w:szCs w:val="16"/>
+                    </w:rPr>
+                    <w:t>()</w:t>
                   </w:r>
                   <w:r>
                     <w:rPr>
@@ -831,6 +933,7 @@
                     </w:rPr>
                     <w:t>{{ data[“</w:t>
                   </w:r>
+                  <w:proofErr w:type="spellStart"/>
                   <w:r>
                     <w:rPr>
                       <w:rFonts w:ascii="Segoe UI" w:hAnsi="Segoe UI" w:cs="Segoe UI"/>
@@ -839,6 +942,7 @@
                     </w:rPr>
                     <w:t>selling_price</w:t>
                   </w:r>
+                  <w:proofErr w:type="spellEnd"/>
                   <w:r>
                     <w:rPr>
                       <w:rFonts w:ascii="Segoe UI" w:hAnsi="Segoe UI" w:cs="Segoe UI"/>
@@ -892,6 +996,7 @@
                     </w:rPr>
                     <w:t>{{ data[“</w:t>
                   </w:r>
+                  <w:proofErr w:type="spellStart"/>
                   <w:r>
                     <w:rPr>
                       <w:rFonts w:ascii="Segoe UI" w:hAnsi="Segoe UI" w:cs="Segoe UI"/>
@@ -900,6 +1005,7 @@
                     </w:rPr>
                     <w:t>amount</w:t>
                   </w:r>
+                  <w:proofErr w:type="spellEnd"/>
                   <w:r>
                     <w:rPr>
                       <w:rFonts w:ascii="Segoe UI" w:hAnsi="Segoe UI" w:cs="Segoe UI"/>
@@ -1107,7 +1213,43 @@
                       <w:sz w:val="16"/>
                       <w:szCs w:val="16"/>
                     </w:rPr>
-                    <w:t>{%tr endfor %}</w:t>
+                    <w:t>{%</w:t>
+                  </w:r>
+                  <w:proofErr w:type="spellStart"/>
+                  <w:r>
+                    <w:rPr>
+                      <w:rFonts w:ascii="Segoe UI" w:hAnsi="Segoe UI" w:cs="Segoe UI"/>
+                      <w:sz w:val="16"/>
+                      <w:szCs w:val="16"/>
+                    </w:rPr>
+                    <w:t>tr</w:t>
+                  </w:r>
+                  <w:proofErr w:type="spellEnd"/>
+                  <w:r>
+                    <w:rPr>
+                      <w:rFonts w:ascii="Segoe UI" w:hAnsi="Segoe UI" w:cs="Segoe UI"/>
+                      <w:sz w:val="16"/>
+                      <w:szCs w:val="16"/>
+                    </w:rPr>
+                    <w:t xml:space="preserve"> </w:t>
+                  </w:r>
+                  <w:proofErr w:type="spellStart"/>
+                  <w:r>
+                    <w:rPr>
+                      <w:rFonts w:ascii="Segoe UI" w:hAnsi="Segoe UI" w:cs="Segoe UI"/>
+                      <w:sz w:val="16"/>
+                      <w:szCs w:val="16"/>
+                    </w:rPr>
+                    <w:t>endfor</w:t>
+                  </w:r>
+                  <w:proofErr w:type="spellEnd"/>
+                  <w:r>
+                    <w:rPr>
+                      <w:rFonts w:ascii="Segoe UI" w:hAnsi="Segoe UI" w:cs="Segoe UI"/>
+                      <w:sz w:val="16"/>
+                      <w:szCs w:val="16"/>
+                    </w:rPr>
+                    <w:t xml:space="preserve"> %}</w:t>
                   </w:r>
                 </w:p>
               </w:tc>
@@ -1619,7 +1761,25 @@
                       <w:sz w:val="16"/>
                       <w:szCs w:val="16"/>
                     </w:rPr>
-                    <w:t>{{ currency }}</w:t>
+                    <w:t xml:space="preserve">{{ </w:t>
+                  </w:r>
+                  <w:proofErr w:type="spellStart"/>
+                  <w:r>
+                    <w:rPr>
+                      <w:rFonts w:ascii="Segoe UI" w:hAnsi="Segoe UI" w:cs="Segoe UI"/>
+                      <w:sz w:val="16"/>
+                      <w:szCs w:val="16"/>
+                    </w:rPr>
+                    <w:t>currency</w:t>
+                  </w:r>
+                  <w:proofErr w:type="spellEnd"/>
+                  <w:r>
+                    <w:rPr>
+                      <w:rFonts w:ascii="Segoe UI" w:hAnsi="Segoe UI" w:cs="Segoe UI"/>
+                      <w:sz w:val="16"/>
+                      <w:szCs w:val="16"/>
+                    </w:rPr>
+                    <w:t xml:space="preserve"> }}</w:t>
                   </w:r>
                 </w:p>
               </w:tc>
@@ -1649,7 +1809,27 @@
                       <w:sz w:val="16"/>
                       <w:szCs w:val="16"/>
                     </w:rPr>
-                    <w:t>{{ total_send }}</w:t>
+                    <w:t xml:space="preserve">{{ </w:t>
+                  </w:r>
+                  <w:proofErr w:type="spellStart"/>
+                  <w:r>
+                    <w:rPr>
+                      <w:rFonts w:ascii="Segoe UI" w:eastAsia="Segoe UI" w:hAnsi="Segoe UI" w:cs="Segoe UI"/>
+                      <w:color w:val="000000"/>
+                      <w:sz w:val="16"/>
+                      <w:szCs w:val="16"/>
+                    </w:rPr>
+                    <w:t>total_send</w:t>
+                  </w:r>
+                  <w:proofErr w:type="spellEnd"/>
+                  <w:r>
+                    <w:rPr>
+                      <w:rFonts w:ascii="Segoe UI" w:eastAsia="Segoe UI" w:hAnsi="Segoe UI" w:cs="Segoe UI"/>
+                      <w:color w:val="000000"/>
+                      <w:sz w:val="16"/>
+                      <w:szCs w:val="16"/>
+                    </w:rPr>
+                    <w:t xml:space="preserve"> }}</w:t>
                   </w:r>
                 </w:p>
               </w:tc>
@@ -1737,7 +1917,25 @@
                       <w:sz w:val="16"/>
                       <w:szCs w:val="16"/>
                     </w:rPr>
-                    <w:t>{{ taxes }}</w:t>
+                    <w:t xml:space="preserve">{{ </w:t>
+                  </w:r>
+                  <w:proofErr w:type="spellStart"/>
+                  <w:r>
+                    <w:rPr>
+                      <w:rFonts w:ascii="Segoe UI" w:hAnsi="Segoe UI" w:cs="Segoe UI"/>
+                      <w:sz w:val="16"/>
+                      <w:szCs w:val="16"/>
+                    </w:rPr>
+                    <w:t>taxes</w:t>
+                  </w:r>
+                  <w:proofErr w:type="spellEnd"/>
+                  <w:r>
+                    <w:rPr>
+                      <w:rFonts w:ascii="Segoe UI" w:hAnsi="Segoe UI" w:cs="Segoe UI"/>
+                      <w:sz w:val="16"/>
+                      <w:szCs w:val="16"/>
+                    </w:rPr>
+                    <w:t xml:space="preserve"> }}</w:t>
                   </w:r>
                 </w:p>
               </w:tc>
@@ -1766,7 +1964,25 @@
                       <w:sz w:val="16"/>
                       <w:szCs w:val="16"/>
                     </w:rPr>
-                    <w:t>{{ rounded }}</w:t>
+                    <w:t xml:space="preserve">{{ </w:t>
+                  </w:r>
+                  <w:proofErr w:type="spellStart"/>
+                  <w:r>
+                    <w:rPr>
+                      <w:rFonts w:ascii="Segoe UI" w:hAnsi="Segoe UI" w:cs="Segoe UI"/>
+                      <w:sz w:val="16"/>
+                      <w:szCs w:val="16"/>
+                    </w:rPr>
+                    <w:t>rounded</w:t>
+                  </w:r>
+                  <w:proofErr w:type="spellEnd"/>
+                  <w:r>
+                    <w:rPr>
+                      <w:rFonts w:ascii="Segoe UI" w:hAnsi="Segoe UI" w:cs="Segoe UI"/>
+                      <w:sz w:val="16"/>
+                      <w:szCs w:val="16"/>
+                    </w:rPr>
+                    <w:t xml:space="preserve"> }}</w:t>
                   </w:r>
                 </w:p>
               </w:tc>
@@ -1797,6 +2013,7 @@
                     </w:rPr>
                     <w:t xml:space="preserve">{{ </w:t>
                   </w:r>
+                  <w:proofErr w:type="spellStart"/>
                   <w:r>
                     <w:rPr>
                       <w:rFonts w:ascii="Segoe UI" w:hAnsi="Segoe UI" w:cs="Segoe UI"/>
@@ -1805,6 +2022,7 @@
                     </w:rPr>
                     <w:t>final_price</w:t>
                   </w:r>
+                  <w:proofErr w:type="spellEnd"/>
                 </w:p>
                 <w:p>
                   <w:pPr>
@@ -2111,7 +2329,35 @@
         <w:rPr>
           <w:lang w:val="en-US"/>
         </w:rPr>
-        <w:t>{% if title_header == “Ítem” %}</w:t>
+        <w:t xml:space="preserve">{% if </w:t>
+      </w:r>
+      <w:proofErr w:type="spellStart"/>
+      <w:r>
+        <w:rPr>
+          <w:lang w:val="en-US"/>
+        </w:rPr>
+        <w:t>title_header</w:t>
+      </w:r>
+      <w:proofErr w:type="spellEnd"/>
+      <w:r>
+        <w:rPr>
+          <w:lang w:val="en-US"/>
+        </w:rPr>
+        <w:t xml:space="preserve"> == “</w:t>
+      </w:r>
+      <w:proofErr w:type="spellStart"/>
+      <w:r>
+        <w:rPr>
+          <w:lang w:val="en-US"/>
+        </w:rPr>
+        <w:t>Ítem</w:t>
+      </w:r>
+      <w:proofErr w:type="spellEnd"/>
+      <w:r>
+        <w:rPr>
+          <w:lang w:val="en-US"/>
+        </w:rPr>
+        <w:t>” %}</w:t>
       </w:r>
       <w:r>
         <w:rPr>
@@ -2152,7 +2398,27 @@
           <w:szCs w:val="18"/>
           <w:lang w:eastAsia="es-CO"/>
         </w:rPr>
-        <w:t xml:space="preserve"> {% endif %}</w:t>
+        <w:t xml:space="preserve"> {% </w:t>
+      </w:r>
+      <w:proofErr w:type="spellStart"/>
+      <w:r>
+        <w:rPr>
+          <w:rFonts w:ascii="Segoe UI" w:hAnsi="Segoe UI" w:cs="Segoe UI"/>
+          <w:sz w:val="18"/>
+          <w:szCs w:val="18"/>
+          <w:lang w:eastAsia="es-CO"/>
+        </w:rPr>
+        <w:t>endif</w:t>
+      </w:r>
+      <w:proofErr w:type="spellEnd"/>
+      <w:r>
+        <w:rPr>
+          <w:rFonts w:ascii="Segoe UI" w:hAnsi="Segoe UI" w:cs="Segoe UI"/>
+          <w:sz w:val="18"/>
+          <w:szCs w:val="18"/>
+          <w:lang w:eastAsia="es-CO"/>
+        </w:rPr>
+        <w:t xml:space="preserve"> %}</w:t>
       </w:r>
     </w:p>
     <w:p>
@@ -2278,6 +2544,7 @@
         </w:rPr>
         <w:t xml:space="preserve">{{ </w:t>
       </w:r>
+      <w:proofErr w:type="spellStart"/>
       <w:r>
         <w:rPr>
           <w:rFonts w:ascii="Segoe UI" w:hAnsi="Segoe UI" w:cs="Segoe UI"/>
@@ -2288,6 +2555,7 @@
         </w:rPr>
         <w:t>currency_text</w:t>
       </w:r>
+      <w:proofErr w:type="spellEnd"/>
       <w:r>
         <w:rPr>
           <w:rFonts w:ascii="Segoe UI" w:hAnsi="Segoe UI" w:cs="Segoe UI"/>
@@ -2424,7 +2692,29 @@
           <w:szCs w:val="18"/>
           <w:lang w:eastAsia="es-CO"/>
         </w:rPr>
-        <w:t>{{ pay_type }}.</w:t>
+        <w:t xml:space="preserve">{{ </w:t>
+      </w:r>
+      <w:proofErr w:type="spellStart"/>
+      <w:r>
+        <w:rPr>
+          <w:rFonts w:ascii="Segoe UI" w:hAnsi="Segoe UI" w:cs="Segoe UI"/>
+          <w:color w:val="000000"/>
+          <w:sz w:val="18"/>
+          <w:szCs w:val="18"/>
+          <w:lang w:eastAsia="es-CO"/>
+        </w:rPr>
+        <w:t>pay_type</w:t>
+      </w:r>
+      <w:proofErr w:type="spellEnd"/>
+      <w:r>
+        <w:rPr>
+          <w:rFonts w:ascii="Segoe UI" w:hAnsi="Segoe UI" w:cs="Segoe UI"/>
+          <w:color w:val="000000"/>
+          <w:sz w:val="18"/>
+          <w:szCs w:val="18"/>
+          <w:lang w:eastAsia="es-CO"/>
+        </w:rPr>
+        <w:t xml:space="preserve"> }}.</w:t>
       </w:r>
     </w:p>
     <w:p>
@@ -2469,7 +2759,29 @@
           <w:szCs w:val="18"/>
           <w:lang w:eastAsia="es-CO"/>
         </w:rPr>
-        <w:t>{{ final_time }}</w:t>
+        <w:t xml:space="preserve">{{ </w:t>
+      </w:r>
+      <w:proofErr w:type="spellStart"/>
+      <w:r>
+        <w:rPr>
+          <w:rFonts w:ascii="Segoe UI" w:hAnsi="Segoe UI" w:cs="Segoe UI"/>
+          <w:color w:val="000000"/>
+          <w:sz w:val="18"/>
+          <w:szCs w:val="18"/>
+          <w:lang w:eastAsia="es-CO"/>
+        </w:rPr>
+        <w:t>final_time</w:t>
+      </w:r>
+      <w:proofErr w:type="spellEnd"/>
+      <w:r>
+        <w:rPr>
+          <w:rFonts w:ascii="Segoe UI" w:hAnsi="Segoe UI" w:cs="Segoe UI"/>
+          <w:color w:val="000000"/>
+          <w:sz w:val="18"/>
+          <w:szCs w:val="18"/>
+          <w:lang w:eastAsia="es-CO"/>
+        </w:rPr>
+        <w:t xml:space="preserve"> }}</w:t>
       </w:r>
       <w:r>
         <w:rPr>
@@ -7213,7 +7525,31 @@
           <w:szCs w:val="18"/>
           <w:lang w:val="es-CO"/>
         </w:rPr>
-        <w:t>{{ contact_imocom.upper() }}</w:t>
+        <w:t xml:space="preserve">{{ </w:t>
+      </w:r>
+      <w:proofErr w:type="spellStart"/>
+      <w:r>
+        <w:rPr>
+          <w:rFonts w:ascii="Segoe UI" w:hAnsi="Segoe UI" w:cs="Segoe UI"/>
+          <w:b/>
+          <w:bCs/>
+          <w:sz w:val="18"/>
+          <w:szCs w:val="18"/>
+          <w:lang w:val="es-CO"/>
+        </w:rPr>
+        <w:t>contact_imocom.upper</w:t>
+      </w:r>
+      <w:proofErr w:type="spellEnd"/>
+      <w:r>
+        <w:rPr>
+          <w:rFonts w:ascii="Segoe UI" w:hAnsi="Segoe UI" w:cs="Segoe UI"/>
+          <w:b/>
+          <w:bCs/>
+          <w:sz w:val="18"/>
+          <w:szCs w:val="18"/>
+          <w:lang w:val="es-CO"/>
+        </w:rPr>
+        <w:t>() }}</w:t>
       </w:r>
     </w:p>
     <w:p>
@@ -7293,7 +7629,31 @@
           <w:szCs w:val="18"/>
           <w:lang w:val="es-CO"/>
         </w:rPr>
-        <w:t>{{ job_title.title() }}</w:t>
+        <w:t xml:space="preserve">{{ </w:t>
+      </w:r>
+      <w:proofErr w:type="spellStart"/>
+      <w:r>
+        <w:rPr>
+          <w:rFonts w:ascii="Segoe UI" w:hAnsi="Segoe UI" w:cs="Segoe UI"/>
+          <w:b/>
+          <w:bCs/>
+          <w:sz w:val="18"/>
+          <w:szCs w:val="18"/>
+          <w:lang w:val="es-CO"/>
+        </w:rPr>
+        <w:t>job_title.title</w:t>
+      </w:r>
+      <w:proofErr w:type="spellEnd"/>
+      <w:r>
+        <w:rPr>
+          <w:rFonts w:ascii="Segoe UI" w:hAnsi="Segoe UI" w:cs="Segoe UI"/>
+          <w:b/>
+          <w:bCs/>
+          <w:sz w:val="18"/>
+          <w:szCs w:val="18"/>
+          <w:lang w:val="es-CO"/>
+        </w:rPr>
+        <w:t>() }}</w:t>
       </w:r>
     </w:p>
     <w:p>
@@ -7308,7 +7668,12 @@
       </w:pPr>
     </w:p>
     <w:sectPr>
-      <w:headerReference w:type="first" r:id="rId13"/>
+      <w:headerReference w:type="even" r:id="rId13"/>
+      <w:headerReference w:type="default" r:id="rId14"/>
+      <w:footerReference w:type="even" r:id="rId15"/>
+      <w:footerReference w:type="default" r:id="rId16"/>
+      <w:headerReference w:type="first" r:id="rId17"/>
+      <w:footerReference w:type="first" r:id="rId18"/>
       <w:pgSz w:w="12240" w:h="15840" w:code="1"/>
       <w:pgMar w:top="1440" w:right="1041" w:bottom="1440" w:left="1134" w:header="708" w:footer="708" w:gutter="0"/>
       <w:cols w:space="708"/>
@@ -7338,6 +7703,36 @@
 </w:endnotes>
 </file>
 
+<file path=word/footer1.xml><?xml version="1.0" encoding="utf-8"?>
+<w:ftr xmlns:wpc="http://schemas.microsoft.com/office/word/2010/wordprocessingCanvas" xmlns:cx="http://schemas.microsoft.com/office/drawing/2014/chartex" xmlns:cx1="http://schemas.microsoft.com/office/drawing/2015/9/8/chartex" xmlns:cx2="http://schemas.microsoft.com/office/drawing/2015/10/21/chartex" xmlns:cx3="http://schemas.microsoft.com/office/drawing/2016/5/9/chartex" xmlns:cx4="http://schemas.microsoft.com/office/drawing/2016/5/10/chartex" xmlns:cx5="http://schemas.microsoft.com/office/drawing/2016/5/11/chartex" xmlns:cx6="http://schemas.microsoft.com/office/drawing/2016/5/12/chartex" xmlns:cx7="http://schemas.microsoft.com/office/drawing/2016/5/13/chartex" xmlns:cx8="http://schemas.microsoft.com/office/drawing/2016/5/14/chartex" xmlns:mc="http://schemas.openxmlformats.org/markup-compatibility/2006" xmlns:aink="http://schemas.microsoft.com/office/drawing/2016/ink" xmlns:am3d="http://schemas.microsoft.com/office/drawing/2017/model3d" xmlns:o="urn:schemas-microsoft-com:office:office" xmlns:oel="http://schemas.microsoft.com/office/2019/extlst" xmlns:r="http://schemas.openxmlformats.org/officeDocument/2006/relationships" xmlns:m="http://schemas.openxmlformats.org/officeDocument/2006/math" xmlns:v="urn:schemas-microsoft-com:vml" xmlns:wp14="http://schemas.microsoft.com/office/word/2010/wordprocessingDrawing" xmlns:wp="http://schemas.openxmlformats.org/drawingml/2006/wordprocessingDrawing" xmlns:w10="urn:schemas-microsoft-com:office:word" xmlns:w="http://schemas.openxmlformats.org/wordprocessingml/2006/main" xmlns:w14="http://schemas.microsoft.com/office/word/2010/wordml" xmlns:w15="http://schemas.microsoft.com/office/word/2012/wordml" xmlns:w16cex="http://schemas.microsoft.com/office/word/2018/wordml/cex" xmlns:w16cid="http://schemas.microsoft.com/office/word/2016/wordml/cid" xmlns:w16="http://schemas.microsoft.com/office/word/2018/wordml" xmlns:w16du="http://schemas.microsoft.com/office/word/2023/wordml/word16du" xmlns:w16sdtdh="http://schemas.microsoft.com/office/word/2020/wordml/sdtdatahash" xmlns:w16sdtfl="http://schemas.microsoft.com/office/word/2024/wordml/sdtformatlock" xmlns:w16se="http://schemas.microsoft.com/office/word/2015/wordml/symex" xmlns:wpg="http://schemas.microsoft.com/office/word/2010/wordprocessingGroup" xmlns:wpi="http://schemas.microsoft.com/office/word/2010/wordprocessingInk" xmlns:wne="http://schemas.microsoft.com/office/word/2006/wordml" xmlns:wps="http://schemas.microsoft.com/office/word/2010/wordprocessingShape" mc:Ignorable="w14 w15 w16se w16cid w16 w16cex w16sdtdh w16sdtfl w16du wp14">
+  <w:p>
+    <w:pPr>
+      <w:pStyle w:val="Piedepgina"/>
+    </w:pPr>
+  </w:p>
+</w:ftr>
+</file>
+
+<file path=word/footer2.xml><?xml version="1.0" encoding="utf-8"?>
+<w:ftr xmlns:wpc="http://schemas.microsoft.com/office/word/2010/wordprocessingCanvas" xmlns:cx="http://schemas.microsoft.com/office/drawing/2014/chartex" xmlns:cx1="http://schemas.microsoft.com/office/drawing/2015/9/8/chartex" xmlns:cx2="http://schemas.microsoft.com/office/drawing/2015/10/21/chartex" xmlns:cx3="http://schemas.microsoft.com/office/drawing/2016/5/9/chartex" xmlns:cx4="http://schemas.microsoft.com/office/drawing/2016/5/10/chartex" xmlns:cx5="http://schemas.microsoft.com/office/drawing/2016/5/11/chartex" xmlns:cx6="http://schemas.microsoft.com/office/drawing/2016/5/12/chartex" xmlns:cx7="http://schemas.microsoft.com/office/drawing/2016/5/13/chartex" xmlns:cx8="http://schemas.microsoft.com/office/drawing/2016/5/14/chartex" xmlns:mc="http://schemas.openxmlformats.org/markup-compatibility/2006" xmlns:aink="http://schemas.microsoft.com/office/drawing/2016/ink" xmlns:am3d="http://schemas.microsoft.com/office/drawing/2017/model3d" xmlns:o="urn:schemas-microsoft-com:office:office" xmlns:oel="http://schemas.microsoft.com/office/2019/extlst" xmlns:r="http://schemas.openxmlformats.org/officeDocument/2006/relationships" xmlns:m="http://schemas.openxmlformats.org/officeDocument/2006/math" xmlns:v="urn:schemas-microsoft-com:vml" xmlns:wp14="http://schemas.microsoft.com/office/word/2010/wordprocessingDrawing" xmlns:wp="http://schemas.openxmlformats.org/drawingml/2006/wordprocessingDrawing" xmlns:w10="urn:schemas-microsoft-com:office:word" xmlns:w="http://schemas.openxmlformats.org/wordprocessingml/2006/main" xmlns:w14="http://schemas.microsoft.com/office/word/2010/wordml" xmlns:w15="http://schemas.microsoft.com/office/word/2012/wordml" xmlns:w16cex="http://schemas.microsoft.com/office/word/2018/wordml/cex" xmlns:w16cid="http://schemas.microsoft.com/office/word/2016/wordml/cid" xmlns:w16="http://schemas.microsoft.com/office/word/2018/wordml" xmlns:w16du="http://schemas.microsoft.com/office/word/2023/wordml/word16du" xmlns:w16sdtdh="http://schemas.microsoft.com/office/word/2020/wordml/sdtdatahash" xmlns:w16sdtfl="http://schemas.microsoft.com/office/word/2024/wordml/sdtformatlock" xmlns:w16se="http://schemas.microsoft.com/office/word/2015/wordml/symex" xmlns:wpg="http://schemas.microsoft.com/office/word/2010/wordprocessingGroup" xmlns:wpi="http://schemas.microsoft.com/office/word/2010/wordprocessingInk" xmlns:wne="http://schemas.microsoft.com/office/word/2006/wordml" xmlns:wps="http://schemas.microsoft.com/office/word/2010/wordprocessingShape" mc:Ignorable="w14 w15 w16se w16cid w16 w16cex w16sdtdh w16sdtfl w16du wp14">
+  <w:p>
+    <w:pPr>
+      <w:pStyle w:val="Piedepgina"/>
+    </w:pPr>
+  </w:p>
+</w:ftr>
+</file>
+
+<file path=word/footer3.xml><?xml version="1.0" encoding="utf-8"?>
+<w:ftr xmlns:wpc="http://schemas.microsoft.com/office/word/2010/wordprocessingCanvas" xmlns:cx="http://schemas.microsoft.com/office/drawing/2014/chartex" xmlns:cx1="http://schemas.microsoft.com/office/drawing/2015/9/8/chartex" xmlns:cx2="http://schemas.microsoft.com/office/drawing/2015/10/21/chartex" xmlns:cx3="http://schemas.microsoft.com/office/drawing/2016/5/9/chartex" xmlns:cx4="http://schemas.microsoft.com/office/drawing/2016/5/10/chartex" xmlns:cx5="http://schemas.microsoft.com/office/drawing/2016/5/11/chartex" xmlns:cx6="http://schemas.microsoft.com/office/drawing/2016/5/12/chartex" xmlns:cx7="http://schemas.microsoft.com/office/drawing/2016/5/13/chartex" xmlns:cx8="http://schemas.microsoft.com/office/drawing/2016/5/14/chartex" xmlns:mc="http://schemas.openxmlformats.org/markup-compatibility/2006" xmlns:aink="http://schemas.microsoft.com/office/drawing/2016/ink" xmlns:am3d="http://schemas.microsoft.com/office/drawing/2017/model3d" xmlns:o="urn:schemas-microsoft-com:office:office" xmlns:oel="http://schemas.microsoft.com/office/2019/extlst" xmlns:r="http://schemas.openxmlformats.org/officeDocument/2006/relationships" xmlns:m="http://schemas.openxmlformats.org/officeDocument/2006/math" xmlns:v="urn:schemas-microsoft-com:vml" xmlns:wp14="http://schemas.microsoft.com/office/word/2010/wordprocessingDrawing" xmlns:wp="http://schemas.openxmlformats.org/drawingml/2006/wordprocessingDrawing" xmlns:w10="urn:schemas-microsoft-com:office:word" xmlns:w="http://schemas.openxmlformats.org/wordprocessingml/2006/main" xmlns:w14="http://schemas.microsoft.com/office/word/2010/wordml" xmlns:w15="http://schemas.microsoft.com/office/word/2012/wordml" xmlns:w16cex="http://schemas.microsoft.com/office/word/2018/wordml/cex" xmlns:w16cid="http://schemas.microsoft.com/office/word/2016/wordml/cid" xmlns:w16="http://schemas.microsoft.com/office/word/2018/wordml" xmlns:w16du="http://schemas.microsoft.com/office/word/2023/wordml/word16du" xmlns:w16sdtdh="http://schemas.microsoft.com/office/word/2020/wordml/sdtdatahash" xmlns:w16sdtfl="http://schemas.microsoft.com/office/word/2024/wordml/sdtformatlock" xmlns:w16se="http://schemas.microsoft.com/office/word/2015/wordml/symex" xmlns:wpg="http://schemas.microsoft.com/office/word/2010/wordprocessingGroup" xmlns:wpi="http://schemas.microsoft.com/office/word/2010/wordprocessingInk" xmlns:wne="http://schemas.microsoft.com/office/word/2006/wordml" xmlns:wps="http://schemas.microsoft.com/office/word/2010/wordprocessingShape" mc:Ignorable="w14 w15 w16se w16cid w16 w16cex w16sdtdh w16sdtfl w16du wp14">
+  <w:p>
+    <w:pPr>
+      <w:pStyle w:val="Piedepgina"/>
+    </w:pPr>
+  </w:p>
+</w:ftr>
+</file>
+
 <file path=word/footnotes.xml><?xml version="1.0" encoding="utf-8"?>
 <w:footnotes xmlns:wpc="http://schemas.microsoft.com/office/word/2010/wordprocessingCanvas" xmlns:cx="http://schemas.microsoft.com/office/drawing/2014/chartex" xmlns:cx1="http://schemas.microsoft.com/office/drawing/2015/9/8/chartex" xmlns:cx2="http://schemas.microsoft.com/office/drawing/2015/10/21/chartex" xmlns:cx3="http://schemas.microsoft.com/office/drawing/2016/5/9/chartex" xmlns:cx4="http://schemas.microsoft.com/office/drawing/2016/5/10/chartex" xmlns:cx5="http://schemas.microsoft.com/office/drawing/2016/5/11/chartex" xmlns:cx6="http://schemas.microsoft.com/office/drawing/2016/5/12/chartex" xmlns:cx7="http://schemas.microsoft.com/office/drawing/2016/5/13/chartex" xmlns:cx8="http://schemas.microsoft.com/office/drawing/2016/5/14/chartex" xmlns:mc="http://schemas.openxmlformats.org/markup-compatibility/2006" xmlns:aink="http://schemas.microsoft.com/office/drawing/2016/ink" xmlns:am3d="http://schemas.microsoft.com/office/drawing/2017/model3d" xmlns:o="urn:schemas-microsoft-com:office:office" xmlns:oel="http://schemas.microsoft.com/office/2019/extlst" xmlns:r="http://schemas.openxmlformats.org/officeDocument/2006/relationships" xmlns:m="http://schemas.openxmlformats.org/officeDocument/2006/math" xmlns:v="urn:schemas-microsoft-com:vml" xmlns:wp14="http://schemas.microsoft.com/office/word/2010/wordprocessingDrawing" xmlns:wp="http://schemas.openxmlformats.org/drawingml/2006/wordprocessingDrawing" xmlns:w10="urn:schemas-microsoft-com:office:word" xmlns:w="http://schemas.openxmlformats.org/wordprocessingml/2006/main" xmlns:w14="http://schemas.microsoft.com/office/word/2010/wordml" xmlns:w15="http://schemas.microsoft.com/office/word/2012/wordml" xmlns:w16cex="http://schemas.microsoft.com/office/word/2018/wordml/cex" xmlns:w16cid="http://schemas.microsoft.com/office/word/2016/wordml/cid" xmlns:w16="http://schemas.microsoft.com/office/word/2018/wordml" xmlns:w16du="http://schemas.microsoft.com/office/word/2023/wordml/word16du" xmlns:w16sdtdh="http://schemas.microsoft.com/office/word/2020/wordml/sdtdatahash" xmlns:w16sdtfl="http://schemas.microsoft.com/office/word/2024/wordml/sdtformatlock" xmlns:w16se="http://schemas.microsoft.com/office/word/2015/wordml/symex" xmlns:wpg="http://schemas.microsoft.com/office/word/2010/wordprocessingGroup" xmlns:wpi="http://schemas.microsoft.com/office/word/2010/wordprocessingInk" xmlns:wne="http://schemas.microsoft.com/office/word/2006/wordml" xmlns:wps="http://schemas.microsoft.com/office/word/2010/wordprocessingShape" mc:Ignorable="w14 w15 w16se w16cid w16 w16cex w16sdtdh w16sdtfl w16du wp14">
   <w:footnote w:type="separator" w:id="-1">
@@ -7358,6 +7753,26 @@
 </file>
 
 <file path=word/header1.xml><?xml version="1.0" encoding="utf-8"?>
+<w:hdr xmlns:wpc="http://schemas.microsoft.com/office/word/2010/wordprocessingCanvas" xmlns:cx="http://schemas.microsoft.com/office/drawing/2014/chartex" xmlns:cx1="http://schemas.microsoft.com/office/drawing/2015/9/8/chartex" xmlns:cx2="http://schemas.microsoft.com/office/drawing/2015/10/21/chartex" xmlns:cx3="http://schemas.microsoft.com/office/drawing/2016/5/9/chartex" xmlns:cx4="http://schemas.microsoft.com/office/drawing/2016/5/10/chartex" xmlns:cx5="http://schemas.microsoft.com/office/drawing/2016/5/11/chartex" xmlns:cx6="http://schemas.microsoft.com/office/drawing/2016/5/12/chartex" xmlns:cx7="http://schemas.microsoft.com/office/drawing/2016/5/13/chartex" xmlns:cx8="http://schemas.microsoft.com/office/drawing/2016/5/14/chartex" xmlns:mc="http://schemas.openxmlformats.org/markup-compatibility/2006" xmlns:aink="http://schemas.microsoft.com/office/drawing/2016/ink" xmlns:am3d="http://schemas.microsoft.com/office/drawing/2017/model3d" xmlns:o="urn:schemas-microsoft-com:office:office" xmlns:oel="http://schemas.microsoft.com/office/2019/extlst" xmlns:r="http://schemas.openxmlformats.org/officeDocument/2006/relationships" xmlns:m="http://schemas.openxmlformats.org/officeDocument/2006/math" xmlns:v="urn:schemas-microsoft-com:vml" xmlns:wp14="http://schemas.microsoft.com/office/word/2010/wordprocessingDrawing" xmlns:wp="http://schemas.openxmlformats.org/drawingml/2006/wordprocessingDrawing" xmlns:w10="urn:schemas-microsoft-com:office:word" xmlns:w="http://schemas.openxmlformats.org/wordprocessingml/2006/main" xmlns:w14="http://schemas.microsoft.com/office/word/2010/wordml" xmlns:w15="http://schemas.microsoft.com/office/word/2012/wordml" xmlns:w16cex="http://schemas.microsoft.com/office/word/2018/wordml/cex" xmlns:w16cid="http://schemas.microsoft.com/office/word/2016/wordml/cid" xmlns:w16="http://schemas.microsoft.com/office/word/2018/wordml" xmlns:w16du="http://schemas.microsoft.com/office/word/2023/wordml/word16du" xmlns:w16sdtdh="http://schemas.microsoft.com/office/word/2020/wordml/sdtdatahash" xmlns:w16sdtfl="http://schemas.microsoft.com/office/word/2024/wordml/sdtformatlock" xmlns:w16se="http://schemas.microsoft.com/office/word/2015/wordml/symex" xmlns:wpg="http://schemas.microsoft.com/office/word/2010/wordprocessingGroup" xmlns:wpi="http://schemas.microsoft.com/office/word/2010/wordprocessingInk" xmlns:wne="http://schemas.microsoft.com/office/word/2006/wordml" xmlns:wps="http://schemas.microsoft.com/office/word/2010/wordprocessingShape" mc:Ignorable="w14 w15 w16se w16cid w16 w16cex w16sdtdh w16sdtfl w16du wp14">
+  <w:p>
+    <w:pPr>
+      <w:pStyle w:val="Encabezado"/>
+    </w:pPr>
+  </w:p>
+</w:hdr>
+</file>
+
+<file path=word/header2.xml><?xml version="1.0" encoding="utf-8"?>
+<w:hdr xmlns:wpc="http://schemas.microsoft.com/office/word/2010/wordprocessingCanvas" xmlns:cx="http://schemas.microsoft.com/office/drawing/2014/chartex" xmlns:cx1="http://schemas.microsoft.com/office/drawing/2015/9/8/chartex" xmlns:cx2="http://schemas.microsoft.com/office/drawing/2015/10/21/chartex" xmlns:cx3="http://schemas.microsoft.com/office/drawing/2016/5/9/chartex" xmlns:cx4="http://schemas.microsoft.com/office/drawing/2016/5/10/chartex" xmlns:cx5="http://schemas.microsoft.com/office/drawing/2016/5/11/chartex" xmlns:cx6="http://schemas.microsoft.com/office/drawing/2016/5/12/chartex" xmlns:cx7="http://schemas.microsoft.com/office/drawing/2016/5/13/chartex" xmlns:cx8="http://schemas.microsoft.com/office/drawing/2016/5/14/chartex" xmlns:mc="http://schemas.openxmlformats.org/markup-compatibility/2006" xmlns:aink="http://schemas.microsoft.com/office/drawing/2016/ink" xmlns:am3d="http://schemas.microsoft.com/office/drawing/2017/model3d" xmlns:o="urn:schemas-microsoft-com:office:office" xmlns:oel="http://schemas.microsoft.com/office/2019/extlst" xmlns:r="http://schemas.openxmlformats.org/officeDocument/2006/relationships" xmlns:m="http://schemas.openxmlformats.org/officeDocument/2006/math" xmlns:v="urn:schemas-microsoft-com:vml" xmlns:wp14="http://schemas.microsoft.com/office/word/2010/wordprocessingDrawing" xmlns:wp="http://schemas.openxmlformats.org/drawingml/2006/wordprocessingDrawing" xmlns:w10="urn:schemas-microsoft-com:office:word" xmlns:w="http://schemas.openxmlformats.org/wordprocessingml/2006/main" xmlns:w14="http://schemas.microsoft.com/office/word/2010/wordml" xmlns:w15="http://schemas.microsoft.com/office/word/2012/wordml" xmlns:w16cex="http://schemas.microsoft.com/office/word/2018/wordml/cex" xmlns:w16cid="http://schemas.microsoft.com/office/word/2016/wordml/cid" xmlns:w16="http://schemas.microsoft.com/office/word/2018/wordml" xmlns:w16du="http://schemas.microsoft.com/office/word/2023/wordml/word16du" xmlns:w16sdtdh="http://schemas.microsoft.com/office/word/2020/wordml/sdtdatahash" xmlns:w16sdtfl="http://schemas.microsoft.com/office/word/2024/wordml/sdtformatlock" xmlns:w16se="http://schemas.microsoft.com/office/word/2015/wordml/symex" xmlns:wpg="http://schemas.microsoft.com/office/word/2010/wordprocessingGroup" xmlns:wpi="http://schemas.microsoft.com/office/word/2010/wordprocessingInk" xmlns:wne="http://schemas.microsoft.com/office/word/2006/wordml" xmlns:wps="http://schemas.microsoft.com/office/word/2010/wordprocessingShape" mc:Ignorable="w14 w15 w16se w16cid w16 w16cex w16sdtdh w16sdtfl w16du wp14">
+  <w:p>
+    <w:pPr>
+      <w:pStyle w:val="Encabezado"/>
+    </w:pPr>
+  </w:p>
+</w:hdr>
+</file>
+
+<file path=word/header3.xml><?xml version="1.0" encoding="utf-8"?>
 <w:hdr xmlns:wpc="http://schemas.microsoft.com/office/word/2010/wordprocessingCanvas" xmlns:cx="http://schemas.microsoft.com/office/drawing/2014/chartex" xmlns:cx1="http://schemas.microsoft.com/office/drawing/2015/9/8/chartex" xmlns:cx2="http://schemas.microsoft.com/office/drawing/2015/10/21/chartex" xmlns:cx3="http://schemas.microsoft.com/office/drawing/2016/5/9/chartex" xmlns:cx4="http://schemas.microsoft.com/office/drawing/2016/5/10/chartex" xmlns:cx5="http://schemas.microsoft.com/office/drawing/2016/5/11/chartex" xmlns:cx6="http://schemas.microsoft.com/office/drawing/2016/5/12/chartex" xmlns:cx7="http://schemas.microsoft.com/office/drawing/2016/5/13/chartex" xmlns:cx8="http://schemas.microsoft.com/office/drawing/2016/5/14/chartex" xmlns:mc="http://schemas.openxmlformats.org/markup-compatibility/2006" xmlns:aink="http://schemas.microsoft.com/office/drawing/2016/ink" xmlns:am3d="http://schemas.microsoft.com/office/drawing/2017/model3d" xmlns:o="urn:schemas-microsoft-com:office:office" xmlns:oel="http://schemas.microsoft.com/office/2019/extlst" xmlns:r="http://schemas.openxmlformats.org/officeDocument/2006/relationships" xmlns:m="http://schemas.openxmlformats.org/officeDocument/2006/math" xmlns:v="urn:schemas-microsoft-com:vml" xmlns:wp14="http://schemas.microsoft.com/office/word/2010/wordprocessingDrawing" xmlns:wp="http://schemas.openxmlformats.org/drawingml/2006/wordprocessingDrawing" xmlns:w10="urn:schemas-microsoft-com:office:word" xmlns:w="http://schemas.openxmlformats.org/wordprocessingml/2006/main" xmlns:w14="http://schemas.microsoft.com/office/word/2010/wordml" xmlns:w15="http://schemas.microsoft.com/office/word/2012/wordml" xmlns:w16cex="http://schemas.microsoft.com/office/word/2018/wordml/cex" xmlns:w16cid="http://schemas.microsoft.com/office/word/2016/wordml/cid" xmlns:w16="http://schemas.microsoft.com/office/word/2018/wordml" xmlns:w16du="http://schemas.microsoft.com/office/word/2023/wordml/word16du" xmlns:w16sdtdh="http://schemas.microsoft.com/office/word/2020/wordml/sdtdatahash" xmlns:w16sdtfl="http://schemas.microsoft.com/office/word/2024/wordml/sdtformatlock" xmlns:w16se="http://schemas.microsoft.com/office/word/2015/wordml/symex" xmlns:wpg="http://schemas.microsoft.com/office/word/2010/wordprocessingGroup" xmlns:wpi="http://schemas.microsoft.com/office/word/2010/wordprocessingInk" xmlns:wne="http://schemas.microsoft.com/office/word/2006/wordml" xmlns:wps="http://schemas.microsoft.com/office/word/2010/wordprocessingShape" mc:Ignorable="w14 w15 w16se w16cid w16 w16cex w16sdtdh w16sdtfl w16du wp14">
   <w:tbl>
     <w:tblPr>
@@ -7668,8 +8083,9 @@
               <w:sz w:val="18"/>
               <w:szCs w:val="18"/>
             </w:rPr>
-            <w:t>{{client</w:t>
+            <w:t>{{</w:t>
           </w:r>
+          <w:proofErr w:type="spellStart"/>
           <w:r>
             <w:rPr>
               <w:rFonts w:ascii="Segoe UI" w:eastAsia="Segoe UI" w:hAnsi="Segoe UI" w:cs="Segoe UI"/>
@@ -7678,8 +8094,9 @@
               <w:sz w:val="18"/>
               <w:szCs w:val="18"/>
             </w:rPr>
-            <w:t>.upper()</w:t>
+            <w:t>client</w:t>
           </w:r>
+          <w:proofErr w:type="spellEnd"/>
           <w:r>
             <w:rPr>
               <w:rFonts w:ascii="Segoe UI" w:eastAsia="Segoe UI" w:hAnsi="Segoe UI" w:cs="Segoe UI"/>
@@ -7777,7 +8194,18 @@
               <w:sz w:val="18"/>
               <w:szCs w:val="18"/>
             </w:rPr>
-            <w:t>{{contact</w:t>
+            <w:t>{{</w:t>
+          </w:r>
+          <w:proofErr w:type="spellStart"/>
+          <w:r>
+            <w:rPr>
+              <w:rFonts w:ascii="Segoe UI" w:eastAsia="Segoe UI" w:hAnsi="Segoe UI" w:cs="Segoe UI"/>
+              <w:bCs/>
+              <w:color w:val="000000"/>
+              <w:sz w:val="18"/>
+              <w:szCs w:val="18"/>
+            </w:rPr>
+            <w:t>contact</w:t>
           </w:r>
           <w:r>
             <w:rPr>
@@ -7789,6 +8217,7 @@
             </w:rPr>
             <w:t>.title</w:t>
           </w:r>
+          <w:proofErr w:type="spellEnd"/>
           <w:r>
             <w:rPr>
               <w:rFonts w:ascii="Segoe UI" w:eastAsia="Segoe UI" w:hAnsi="Segoe UI" w:cs="Segoe UI"/>
@@ -7828,7 +8257,18 @@
               <w:sz w:val="18"/>
               <w:szCs w:val="18"/>
             </w:rPr>
-            <w:t>{{address</w:t>
+            <w:t>{{</w:t>
+          </w:r>
+          <w:proofErr w:type="spellStart"/>
+          <w:r>
+            <w:rPr>
+              <w:rFonts w:ascii="Segoe UI" w:eastAsia="Segoe UI" w:hAnsi="Segoe UI" w:cs="Segoe UI"/>
+              <w:bCs/>
+              <w:color w:val="000000"/>
+              <w:sz w:val="18"/>
+              <w:szCs w:val="18"/>
+            </w:rPr>
+            <w:t>address</w:t>
           </w:r>
           <w:r>
             <w:rPr>
@@ -7838,7 +8278,18 @@
               <w:sz w:val="18"/>
               <w:szCs w:val="18"/>
             </w:rPr>
-            <w:t>.upper()</w:t>
+            <w:t>.upper</w:t>
+          </w:r>
+          <w:proofErr w:type="spellEnd"/>
+          <w:r>
+            <w:rPr>
+              <w:rFonts w:ascii="Segoe UI" w:eastAsia="Segoe UI" w:hAnsi="Segoe UI" w:cs="Segoe UI"/>
+              <w:bCs/>
+              <w:color w:val="000000"/>
+              <w:sz w:val="18"/>
+              <w:szCs w:val="18"/>
+            </w:rPr>
+            <w:t>()</w:t>
           </w:r>
           <w:r>
             <w:rPr>
@@ -7867,6 +8318,7 @@
             </w:rPr>
             <w:t>{{</w:t>
           </w:r>
+          <w:proofErr w:type="spellStart"/>
           <w:r>
             <w:rPr>
               <w:rFonts w:ascii="Segoe UI" w:hAnsi="Segoe UI" w:cs="Segoe UI"/>
@@ -7883,7 +8335,18 @@
               <w:sz w:val="18"/>
               <w:szCs w:val="18"/>
             </w:rPr>
-            <w:t>.upper()</w:t>
+            <w:t>.upper</w:t>
+          </w:r>
+          <w:proofErr w:type="spellEnd"/>
+          <w:r>
+            <w:rPr>
+              <w:rFonts w:ascii="Segoe UI" w:eastAsia="Segoe UI" w:hAnsi="Segoe UI" w:cs="Segoe UI"/>
+              <w:bCs/>
+              <w:color w:val="000000"/>
+              <w:sz w:val="18"/>
+              <w:szCs w:val="18"/>
+            </w:rPr>
+            <w:t>()</w:t>
           </w:r>
           <w:r>
             <w:rPr>
@@ -7990,7 +8453,29 @@
               <w:sz w:val="18"/>
               <w:szCs w:val="18"/>
             </w:rPr>
-            <w:t>{{cv}}</w:t>
+            <w:t>{{</w:t>
+          </w:r>
+          <w:proofErr w:type="spellStart"/>
+          <w:r>
+            <w:rPr>
+              <w:rFonts w:ascii="Segoe UI" w:hAnsi="Segoe UI" w:cs="Segoe UI"/>
+              <w:b/>
+              <w:bCs/>
+              <w:sz w:val="18"/>
+              <w:szCs w:val="18"/>
+            </w:rPr>
+            <w:t>cv</w:t>
+          </w:r>
+          <w:proofErr w:type="spellEnd"/>
+          <w:r>
+            <w:rPr>
+              <w:rFonts w:ascii="Segoe UI" w:hAnsi="Segoe UI" w:cs="Segoe UI"/>
+              <w:b/>
+              <w:bCs/>
+              <w:sz w:val="18"/>
+              <w:szCs w:val="18"/>
+            </w:rPr>
+            <w:t>}}</w:t>
           </w:r>
         </w:p>
         <w:p>

</xml_diff>

<commit_message>
Add decimal point function in prices
</commit_message>
<xml_diff>
--- a/src/assets/schema.docx
+++ b/src/assets/schema.docx
@@ -542,13 +542,23 @@
                       <w:szCs w:val="16"/>
                     </w:rPr>
                   </w:pPr>
+                  <w:proofErr w:type="gramStart"/>
                   <w:r>
                     <w:rPr>
                       <w:rFonts w:ascii="Segoe UI" w:hAnsi="Segoe UI" w:cs="Segoe UI"/>
                       <w:sz w:val="16"/>
                       <w:szCs w:val="16"/>
                     </w:rPr>
-                    <w:t>{{ data[“</w:t>
+                    <w:t>{{ data</w:t>
+                  </w:r>
+                  <w:proofErr w:type="gramEnd"/>
+                  <w:r>
+                    <w:rPr>
+                      <w:rFonts w:ascii="Segoe UI" w:hAnsi="Segoe UI" w:cs="Segoe UI"/>
+                      <w:sz w:val="16"/>
+                      <w:szCs w:val="16"/>
+                    </w:rPr>
+                    <w:t>[“</w:t>
                   </w:r>
                   <w:proofErr w:type="spellStart"/>
                   <w:r>
@@ -566,7 +576,16 @@
                       <w:sz w:val="16"/>
                       <w:szCs w:val="16"/>
                     </w:rPr>
-                    <w:t>”]</w:t>
+                    <w:t>”</w:t>
+                  </w:r>
+                  <w:proofErr w:type="gramStart"/>
+                  <w:r>
+                    <w:rPr>
+                      <w:rFonts w:ascii="Segoe UI" w:hAnsi="Segoe UI" w:cs="Segoe UI"/>
+                      <w:sz w:val="16"/>
+                      <w:szCs w:val="16"/>
+                    </w:rPr>
+                    <w:t>]</w:t>
                   </w:r>
                   <w:r>
                     <w:rPr>
@@ -586,6 +605,7 @@
                     <w:t>upper</w:t>
                   </w:r>
                   <w:proofErr w:type="spellEnd"/>
+                  <w:proofErr w:type="gramEnd"/>
                   <w:r>
                     <w:rPr>
                       <w:rFonts w:ascii="Segoe UI" w:hAnsi="Segoe UI" w:cs="Segoe UI"/>
@@ -630,13 +650,23 @@
                       <w:szCs w:val="16"/>
                     </w:rPr>
                   </w:pPr>
+                  <w:proofErr w:type="gramStart"/>
                   <w:r>
                     <w:rPr>
                       <w:rFonts w:ascii="Segoe UI" w:hAnsi="Segoe UI" w:cs="Segoe UI"/>
                       <w:sz w:val="16"/>
                       <w:szCs w:val="16"/>
                     </w:rPr>
-                    <w:t>{{ data[“</w:t>
+                    <w:t>{{ data</w:t>
+                  </w:r>
+                  <w:proofErr w:type="gramEnd"/>
+                  <w:r>
+                    <w:rPr>
+                      <w:rFonts w:ascii="Segoe UI" w:hAnsi="Segoe UI" w:cs="Segoe UI"/>
+                      <w:sz w:val="16"/>
+                      <w:szCs w:val="16"/>
+                    </w:rPr>
+                    <w:t>[“</w:t>
                   </w:r>
                   <w:proofErr w:type="spellStart"/>
                   <w:r>
@@ -654,7 +684,16 @@
                       <w:sz w:val="16"/>
                       <w:szCs w:val="16"/>
                     </w:rPr>
-                    <w:t>”]</w:t>
+                    <w:t>”</w:t>
+                  </w:r>
+                  <w:proofErr w:type="gramStart"/>
+                  <w:r>
+                    <w:rPr>
+                      <w:rFonts w:ascii="Segoe UI" w:hAnsi="Segoe UI" w:cs="Segoe UI"/>
+                      <w:sz w:val="16"/>
+                      <w:szCs w:val="16"/>
+                    </w:rPr>
+                    <w:t>]</w:t>
                   </w:r>
                   <w:r>
                     <w:rPr>
@@ -674,6 +713,7 @@
                     <w:t>upper</w:t>
                   </w:r>
                   <w:proofErr w:type="spellEnd"/>
+                  <w:proofErr w:type="gramEnd"/>
                   <w:r>
                     <w:rPr>
                       <w:rFonts w:ascii="Segoe UI" w:hAnsi="Segoe UI" w:cs="Segoe UI"/>
@@ -710,13 +750,23 @@
                       <w:szCs w:val="16"/>
                     </w:rPr>
                   </w:pPr>
+                  <w:proofErr w:type="gramStart"/>
                   <w:r>
                     <w:rPr>
                       <w:rFonts w:ascii="Segoe UI" w:hAnsi="Segoe UI" w:cs="Segoe UI"/>
                       <w:sz w:val="16"/>
                       <w:szCs w:val="16"/>
                     </w:rPr>
-                    <w:t>{{ data[“</w:t>
+                    <w:t>{{ data</w:t>
+                  </w:r>
+                  <w:proofErr w:type="gramEnd"/>
+                  <w:r>
+                    <w:rPr>
+                      <w:rFonts w:ascii="Segoe UI" w:hAnsi="Segoe UI" w:cs="Segoe UI"/>
+                      <w:sz w:val="16"/>
+                      <w:szCs w:val="16"/>
+                    </w:rPr>
+                    <w:t>[“</w:t>
                   </w:r>
                   <w:proofErr w:type="spellStart"/>
                   <w:r>
@@ -773,13 +823,23 @@
                       <w:szCs w:val="16"/>
                     </w:rPr>
                   </w:pPr>
+                  <w:proofErr w:type="gramStart"/>
                   <w:r>
                     <w:rPr>
                       <w:rFonts w:ascii="Segoe UI" w:hAnsi="Segoe UI" w:cs="Segoe UI"/>
                       <w:sz w:val="16"/>
                       <w:szCs w:val="16"/>
                     </w:rPr>
-                    <w:t>{{ data[“</w:t>
+                    <w:t>{{ data</w:t>
+                  </w:r>
+                  <w:proofErr w:type="gramEnd"/>
+                  <w:r>
+                    <w:rPr>
+                      <w:rFonts w:ascii="Segoe UI" w:hAnsi="Segoe UI" w:cs="Segoe UI"/>
+                      <w:sz w:val="16"/>
+                      <w:szCs w:val="16"/>
+                    </w:rPr>
+                    <w:t>[“</w:t>
                   </w:r>
                   <w:proofErr w:type="spellStart"/>
                   <w:r>
@@ -836,13 +896,23 @@
                       <w:szCs w:val="16"/>
                     </w:rPr>
                   </w:pPr>
+                  <w:proofErr w:type="gramStart"/>
                   <w:r>
                     <w:rPr>
                       <w:rFonts w:ascii="Segoe UI" w:hAnsi="Segoe UI" w:cs="Segoe UI"/>
                       <w:sz w:val="16"/>
                       <w:szCs w:val="16"/>
                     </w:rPr>
-                    <w:t>{{ data[“</w:t>
+                    <w:t>{{ data</w:t>
+                  </w:r>
+                  <w:proofErr w:type="gramEnd"/>
+                  <w:r>
+                    <w:rPr>
+                      <w:rFonts w:ascii="Segoe UI" w:hAnsi="Segoe UI" w:cs="Segoe UI"/>
+                      <w:sz w:val="16"/>
+                      <w:szCs w:val="16"/>
+                    </w:rPr>
+                    <w:t>[“</w:t>
                   </w:r>
                   <w:proofErr w:type="spellStart"/>
                   <w:r>
@@ -860,7 +930,16 @@
                       <w:sz w:val="16"/>
                       <w:szCs w:val="16"/>
                     </w:rPr>
-                    <w:t>”]</w:t>
+                    <w:t>”</w:t>
+                  </w:r>
+                  <w:proofErr w:type="gramStart"/>
+                  <w:r>
+                    <w:rPr>
+                      <w:rFonts w:ascii="Segoe UI" w:hAnsi="Segoe UI" w:cs="Segoe UI"/>
+                      <w:sz w:val="16"/>
+                      <w:szCs w:val="16"/>
+                    </w:rPr>
+                    <w:t>]</w:t>
                   </w:r>
                   <w:r>
                     <w:rPr>
@@ -880,6 +959,7 @@
                     <w:t>upper</w:t>
                   </w:r>
                   <w:proofErr w:type="spellEnd"/>
+                  <w:proofErr w:type="gramEnd"/>
                   <w:r>
                     <w:rPr>
                       <w:rFonts w:ascii="Segoe UI" w:hAnsi="Segoe UI" w:cs="Segoe UI"/>
@@ -925,13 +1005,23 @@
                       <w:szCs w:val="16"/>
                     </w:rPr>
                   </w:pPr>
+                  <w:proofErr w:type="gramStart"/>
                   <w:r>
                     <w:rPr>
                       <w:rFonts w:ascii="Segoe UI" w:hAnsi="Segoe UI" w:cs="Segoe UI"/>
                       <w:sz w:val="16"/>
                       <w:szCs w:val="16"/>
                     </w:rPr>
-                    <w:t>{{ data[“</w:t>
+                    <w:t>{{ data</w:t>
+                  </w:r>
+                  <w:proofErr w:type="gramEnd"/>
+                  <w:r>
+                    <w:rPr>
+                      <w:rFonts w:ascii="Segoe UI" w:hAnsi="Segoe UI" w:cs="Segoe UI"/>
+                      <w:sz w:val="16"/>
+                      <w:szCs w:val="16"/>
+                    </w:rPr>
+                    <w:t>[“</w:t>
                   </w:r>
                   <w:proofErr w:type="spellStart"/>
                   <w:r>
@@ -988,13 +1078,23 @@
                       <w:szCs w:val="16"/>
                     </w:rPr>
                   </w:pPr>
+                  <w:proofErr w:type="gramStart"/>
                   <w:r>
                     <w:rPr>
                       <w:rFonts w:ascii="Segoe UI" w:hAnsi="Segoe UI" w:cs="Segoe UI"/>
                       <w:sz w:val="16"/>
                       <w:szCs w:val="16"/>
                     </w:rPr>
-                    <w:t>{{ data[“</w:t>
+                    <w:t>{{ data</w:t>
+                  </w:r>
+                  <w:proofErr w:type="gramEnd"/>
+                  <w:r>
+                    <w:rPr>
+                      <w:rFonts w:ascii="Segoe UI" w:hAnsi="Segoe UI" w:cs="Segoe UI"/>
+                      <w:sz w:val="16"/>
+                      <w:szCs w:val="16"/>
+                    </w:rPr>
+                    <w:t>[“</w:t>
                   </w:r>
                   <w:proofErr w:type="spellStart"/>
                   <w:r>
@@ -1755,6 +1855,7 @@
                       <w:szCs w:val="16"/>
                     </w:rPr>
                   </w:pPr>
+                  <w:proofErr w:type="gramStart"/>
                   <w:r>
                     <w:rPr>
                       <w:rFonts w:ascii="Segoe UI" w:hAnsi="Segoe UI" w:cs="Segoe UI"/>
@@ -1773,6 +1874,7 @@
                     <w:t>currency</w:t>
                   </w:r>
                   <w:proofErr w:type="spellEnd"/>
+                  <w:proofErr w:type="gramEnd"/>
                   <w:r>
                     <w:rPr>
                       <w:rFonts w:ascii="Segoe UI" w:hAnsi="Segoe UI" w:cs="Segoe UI"/>
@@ -1802,6 +1904,7 @@
                       <w:szCs w:val="16"/>
                     </w:rPr>
                   </w:pPr>
+                  <w:proofErr w:type="gramStart"/>
                   <w:r>
                     <w:rPr>
                       <w:rFonts w:ascii="Segoe UI" w:eastAsia="Segoe UI" w:hAnsi="Segoe UI" w:cs="Segoe UI"/>
@@ -1819,7 +1922,17 @@
                       <w:sz w:val="16"/>
                       <w:szCs w:val="16"/>
                     </w:rPr>
-                    <w:t>total_send</w:t>
+                    <w:t>total</w:t>
+                  </w:r>
+                  <w:proofErr w:type="gramEnd"/>
+                  <w:r>
+                    <w:rPr>
+                      <w:rFonts w:ascii="Segoe UI" w:eastAsia="Segoe UI" w:hAnsi="Segoe UI" w:cs="Segoe UI"/>
+                      <w:color w:val="000000"/>
+                      <w:sz w:val="16"/>
+                      <w:szCs w:val="16"/>
+                    </w:rPr>
+                    <w:t>_send</w:t>
                   </w:r>
                   <w:proofErr w:type="spellEnd"/>
                   <w:r>
@@ -1882,13 +1995,23 @@
                       <w:szCs w:val="16"/>
                     </w:rPr>
                   </w:pPr>
+                  <w:proofErr w:type="gramStart"/>
                   <w:r>
                     <w:rPr>
                       <w:rFonts w:ascii="Segoe UI" w:hAnsi="Segoe UI" w:cs="Segoe UI"/>
                       <w:sz w:val="16"/>
                       <w:szCs w:val="16"/>
                     </w:rPr>
-                    <w:t>{{ total }}</w:t>
+                    <w:t>{{ total</w:t>
+                  </w:r>
+                  <w:proofErr w:type="gramEnd"/>
+                  <w:r>
+                    <w:rPr>
+                      <w:rFonts w:ascii="Segoe UI" w:hAnsi="Segoe UI" w:cs="Segoe UI"/>
+                      <w:sz w:val="16"/>
+                      <w:szCs w:val="16"/>
+                    </w:rPr>
+                    <w:t xml:space="preserve"> }}</w:t>
                   </w:r>
                 </w:p>
               </w:tc>
@@ -1911,6 +2034,7 @@
                       <w:szCs w:val="16"/>
                     </w:rPr>
                   </w:pPr>
+                  <w:proofErr w:type="gramStart"/>
                   <w:r>
                     <w:rPr>
                       <w:rFonts w:ascii="Segoe UI" w:hAnsi="Segoe UI" w:cs="Segoe UI"/>
@@ -1929,6 +2053,7 @@
                     <w:t>taxes</w:t>
                   </w:r>
                   <w:proofErr w:type="spellEnd"/>
+                  <w:proofErr w:type="gramEnd"/>
                   <w:r>
                     <w:rPr>
                       <w:rFonts w:ascii="Segoe UI" w:hAnsi="Segoe UI" w:cs="Segoe UI"/>
@@ -1958,6 +2083,7 @@
                       <w:szCs w:val="16"/>
                     </w:rPr>
                   </w:pPr>
+                  <w:proofErr w:type="gramStart"/>
                   <w:r>
                     <w:rPr>
                       <w:rFonts w:ascii="Segoe UI" w:hAnsi="Segoe UI" w:cs="Segoe UI"/>
@@ -1976,6 +2102,7 @@
                     <w:t>rounded</w:t>
                   </w:r>
                   <w:proofErr w:type="spellEnd"/>
+                  <w:proofErr w:type="gramEnd"/>
                   <w:r>
                     <w:rPr>
                       <w:rFonts w:ascii="Segoe UI" w:hAnsi="Segoe UI" w:cs="Segoe UI"/>
@@ -2005,6 +2132,7 @@
                       <w:szCs w:val="16"/>
                     </w:rPr>
                   </w:pPr>
+                  <w:proofErr w:type="gramStart"/>
                   <w:r>
                     <w:rPr>
                       <w:rFonts w:ascii="Segoe UI" w:hAnsi="Segoe UI" w:cs="Segoe UI"/>
@@ -2020,7 +2148,16 @@
                       <w:sz w:val="16"/>
                       <w:szCs w:val="16"/>
                     </w:rPr>
-                    <w:t>final_price</w:t>
+                    <w:t>final</w:t>
+                  </w:r>
+                  <w:proofErr w:type="gramEnd"/>
+                  <w:r>
+                    <w:rPr>
+                      <w:rFonts w:ascii="Segoe UI" w:hAnsi="Segoe UI" w:cs="Segoe UI"/>
+                      <w:sz w:val="16"/>
+                      <w:szCs w:val="16"/>
+                    </w:rPr>
+                    <w:t>_price</w:t>
                   </w:r>
                   <w:proofErr w:type="spellEnd"/>
                 </w:p>
@@ -2357,7 +2494,14 @@
         <w:rPr>
           <w:lang w:val="en-US"/>
         </w:rPr>
-        <w:t>” %}</w:t>
+        <w:t xml:space="preserve">” </w:t>
+      </w:r>
+      <w:proofErr w:type="gramStart"/>
+      <w:r>
+        <w:rPr>
+          <w:lang w:val="en-US"/>
+        </w:rPr>
+        <w:t>%}</w:t>
       </w:r>
       <w:r>
         <w:rPr>
@@ -2369,7 +2513,20 @@
           <w:szCs w:val="18"/>
           <w:lang w:val="en-US" w:eastAsia="es-CO"/>
         </w:rPr>
-        <w:t>Nota 3.</w:t>
+        <w:t>Nota</w:t>
+      </w:r>
+      <w:proofErr w:type="gramEnd"/>
+      <w:r>
+        <w:rPr>
+          <w:rFonts w:ascii="Segoe UI" w:hAnsi="Segoe UI" w:cs="Segoe UI"/>
+          <w:b/>
+          <w:bCs/>
+          <w:color w:val="000000"/>
+          <w:sz w:val="18"/>
+          <w:szCs w:val="18"/>
+          <w:lang w:val="en-US" w:eastAsia="es-CO"/>
+        </w:rPr>
+        <w:t xml:space="preserve"> 3.</w:t>
       </w:r>
       <w:r>
         <w:rPr>
@@ -2534,6 +2691,7 @@
         </w:rPr>
         <w:tab/>
       </w:r>
+      <w:proofErr w:type="gramStart"/>
       <w:r>
         <w:rPr>
           <w:rFonts w:ascii="Segoe UI" w:hAnsi="Segoe UI" w:cs="Segoe UI"/>
@@ -2553,7 +2711,29 @@
           <w:szCs w:val="18"/>
           <w:lang w:eastAsia="es-CO"/>
         </w:rPr>
-        <w:t>currency_text</w:t>
+        <w:t>currency</w:t>
+      </w:r>
+      <w:proofErr w:type="gramEnd"/>
+      <w:r>
+        <w:rPr>
+          <w:rFonts w:ascii="Segoe UI" w:hAnsi="Segoe UI" w:cs="Segoe UI"/>
+          <w:color w:val="000000"/>
+          <w:sz w:val="18"/>
+          <w:szCs w:val="18"/>
+          <w:lang w:eastAsia="es-CO"/>
+        </w:rPr>
+        <w:t>_</w:t>
+      </w:r>
+      <w:proofErr w:type="gramStart"/>
+      <w:r>
+        <w:rPr>
+          <w:rFonts w:ascii="Segoe UI" w:hAnsi="Segoe UI" w:cs="Segoe UI"/>
+          <w:color w:val="000000"/>
+          <w:sz w:val="18"/>
+          <w:szCs w:val="18"/>
+          <w:lang w:eastAsia="es-CO"/>
+        </w:rPr>
+        <w:t>text</w:t>
       </w:r>
       <w:proofErr w:type="spellEnd"/>
       <w:r>
@@ -2564,7 +2744,18 @@
           <w:szCs w:val="18"/>
           <w:lang w:eastAsia="es-CO"/>
         </w:rPr>
-        <w:t xml:space="preserve"> }}</w:t>
+        <w:t xml:space="preserve"> }</w:t>
+      </w:r>
+      <w:proofErr w:type="gramEnd"/>
+      <w:r>
+        <w:rPr>
+          <w:rFonts w:ascii="Segoe UI" w:hAnsi="Segoe UI" w:cs="Segoe UI"/>
+          <w:color w:val="000000"/>
+          <w:sz w:val="18"/>
+          <w:szCs w:val="18"/>
+          <w:lang w:eastAsia="es-CO"/>
+        </w:rPr>
+        <w:t>}</w:t>
       </w:r>
       <w:r>
         <w:rPr>
@@ -2684,6 +2875,7 @@
         </w:rPr>
         <w:tab/>
       </w:r>
+      <w:proofErr w:type="gramStart"/>
       <w:r>
         <w:rPr>
           <w:rFonts w:ascii="Segoe UI" w:hAnsi="Segoe UI" w:cs="Segoe UI"/>
@@ -2703,7 +2895,29 @@
           <w:szCs w:val="18"/>
           <w:lang w:eastAsia="es-CO"/>
         </w:rPr>
-        <w:t>pay_type</w:t>
+        <w:t>pay</w:t>
+      </w:r>
+      <w:proofErr w:type="gramEnd"/>
+      <w:r>
+        <w:rPr>
+          <w:rFonts w:ascii="Segoe UI" w:hAnsi="Segoe UI" w:cs="Segoe UI"/>
+          <w:color w:val="000000"/>
+          <w:sz w:val="18"/>
+          <w:szCs w:val="18"/>
+          <w:lang w:eastAsia="es-CO"/>
+        </w:rPr>
+        <w:t>_</w:t>
+      </w:r>
+      <w:proofErr w:type="gramStart"/>
+      <w:r>
+        <w:rPr>
+          <w:rFonts w:ascii="Segoe UI" w:hAnsi="Segoe UI" w:cs="Segoe UI"/>
+          <w:color w:val="000000"/>
+          <w:sz w:val="18"/>
+          <w:szCs w:val="18"/>
+          <w:lang w:eastAsia="es-CO"/>
+        </w:rPr>
+        <w:t>type</w:t>
       </w:r>
       <w:proofErr w:type="spellEnd"/>
       <w:r>
@@ -2714,7 +2928,18 @@
           <w:szCs w:val="18"/>
           <w:lang w:eastAsia="es-CO"/>
         </w:rPr>
-        <w:t xml:space="preserve"> }}.</w:t>
+        <w:t xml:space="preserve"> }</w:t>
+      </w:r>
+      <w:proofErr w:type="gramEnd"/>
+      <w:r>
+        <w:rPr>
+          <w:rFonts w:ascii="Segoe UI" w:hAnsi="Segoe UI" w:cs="Segoe UI"/>
+          <w:color w:val="000000"/>
+          <w:sz w:val="18"/>
+          <w:szCs w:val="18"/>
+          <w:lang w:eastAsia="es-CO"/>
+        </w:rPr>
+        <w:t>}.</w:t>
       </w:r>
     </w:p>
     <w:p>
@@ -2751,6 +2976,7 @@
         </w:rPr>
         <w:tab/>
       </w:r>
+      <w:proofErr w:type="gramStart"/>
       <w:r>
         <w:rPr>
           <w:rFonts w:ascii="Segoe UI" w:hAnsi="Segoe UI" w:cs="Segoe UI"/>
@@ -2770,7 +2996,29 @@
           <w:szCs w:val="18"/>
           <w:lang w:eastAsia="es-CO"/>
         </w:rPr>
-        <w:t>final_time</w:t>
+        <w:t>final</w:t>
+      </w:r>
+      <w:proofErr w:type="gramEnd"/>
+      <w:r>
+        <w:rPr>
+          <w:rFonts w:ascii="Segoe UI" w:hAnsi="Segoe UI" w:cs="Segoe UI"/>
+          <w:color w:val="000000"/>
+          <w:sz w:val="18"/>
+          <w:szCs w:val="18"/>
+          <w:lang w:eastAsia="es-CO"/>
+        </w:rPr>
+        <w:t>_</w:t>
+      </w:r>
+      <w:proofErr w:type="gramStart"/>
+      <w:r>
+        <w:rPr>
+          <w:rFonts w:ascii="Segoe UI" w:hAnsi="Segoe UI" w:cs="Segoe UI"/>
+          <w:color w:val="000000"/>
+          <w:sz w:val="18"/>
+          <w:szCs w:val="18"/>
+          <w:lang w:eastAsia="es-CO"/>
+        </w:rPr>
+        <w:t>time</w:t>
       </w:r>
       <w:proofErr w:type="spellEnd"/>
       <w:r>
@@ -2781,7 +3029,18 @@
           <w:szCs w:val="18"/>
           <w:lang w:eastAsia="es-CO"/>
         </w:rPr>
-        <w:t xml:space="preserve"> }}</w:t>
+        <w:t xml:space="preserve"> }</w:t>
+      </w:r>
+      <w:proofErr w:type="gramEnd"/>
+      <w:r>
+        <w:rPr>
+          <w:rFonts w:ascii="Segoe UI" w:hAnsi="Segoe UI" w:cs="Segoe UI"/>
+          <w:color w:val="000000"/>
+          <w:sz w:val="18"/>
+          <w:szCs w:val="18"/>
+          <w:lang w:eastAsia="es-CO"/>
+        </w:rPr>
+        <w:t>}</w:t>
       </w:r>
       <w:r>
         <w:rPr>
@@ -7162,7 +7421,27 @@
           <w:sz w:val="18"/>
           <w:szCs w:val="18"/>
         </w:rPr>
-        <w:t>ST PRO 01 FOR 01</w:t>
+        <w:t xml:space="preserve">ST </w:t>
+      </w:r>
+      <w:proofErr w:type="gramStart"/>
+      <w:r>
+        <w:rPr>
+          <w:rFonts w:ascii="Segoe UI" w:eastAsia="Segoe UI" w:hAnsi="Segoe UI" w:cs="Segoe UI"/>
+          <w:b/>
+          <w:sz w:val="18"/>
+          <w:szCs w:val="18"/>
+        </w:rPr>
+        <w:t>PRO 01</w:t>
+      </w:r>
+      <w:proofErr w:type="gramEnd"/>
+      <w:r>
+        <w:rPr>
+          <w:rFonts w:ascii="Segoe UI" w:eastAsia="Segoe UI" w:hAnsi="Segoe UI" w:cs="Segoe UI"/>
+          <w:b/>
+          <w:sz w:val="18"/>
+          <w:szCs w:val="18"/>
+        </w:rPr>
+        <w:t xml:space="preserve"> FOR 01</w:t>
       </w:r>
       <w:r>
         <w:rPr>
@@ -7516,6 +7795,7 @@
         </w:rPr>
         <w:tab/>
       </w:r>
+      <w:proofErr w:type="gramStart"/>
       <w:r>
         <w:rPr>
           <w:rFonts w:ascii="Segoe UI" w:hAnsi="Segoe UI" w:cs="Segoe UI"/>
@@ -7537,9 +7817,9 @@
           <w:szCs w:val="18"/>
           <w:lang w:val="es-CO"/>
         </w:rPr>
-        <w:t>contact_imocom.upper</w:t>
-      </w:r>
-      <w:proofErr w:type="spellEnd"/>
+        <w:t>contact</w:t>
+      </w:r>
+      <w:proofErr w:type="gramEnd"/>
       <w:r>
         <w:rPr>
           <w:rFonts w:ascii="Segoe UI" w:hAnsi="Segoe UI" w:cs="Segoe UI"/>
@@ -7549,7 +7829,56 @@
           <w:szCs w:val="18"/>
           <w:lang w:val="es-CO"/>
         </w:rPr>
-        <w:t>() }}</w:t>
+        <w:t>_</w:t>
+      </w:r>
+      <w:proofErr w:type="gramStart"/>
+      <w:r>
+        <w:rPr>
+          <w:rFonts w:ascii="Segoe UI" w:hAnsi="Segoe UI" w:cs="Segoe UI"/>
+          <w:b/>
+          <w:bCs/>
+          <w:sz w:val="18"/>
+          <w:szCs w:val="18"/>
+          <w:lang w:val="es-CO"/>
+        </w:rPr>
+        <w:t>imocom.upper</w:t>
+      </w:r>
+      <w:proofErr w:type="spellEnd"/>
+      <w:proofErr w:type="gramEnd"/>
+      <w:r>
+        <w:rPr>
+          <w:rFonts w:ascii="Segoe UI" w:hAnsi="Segoe UI" w:cs="Segoe UI"/>
+          <w:b/>
+          <w:bCs/>
+          <w:sz w:val="18"/>
+          <w:szCs w:val="18"/>
+          <w:lang w:val="es-CO"/>
+        </w:rPr>
+        <w:t>(</w:t>
+      </w:r>
+      <w:proofErr w:type="gramStart"/>
+      <w:r>
+        <w:rPr>
+          <w:rFonts w:ascii="Segoe UI" w:hAnsi="Segoe UI" w:cs="Segoe UI"/>
+          <w:b/>
+          <w:bCs/>
+          <w:sz w:val="18"/>
+          <w:szCs w:val="18"/>
+          <w:lang w:val="es-CO"/>
+        </w:rPr>
+        <w:t>) }</w:t>
+      </w:r>
+      <w:proofErr w:type="gramEnd"/>
+      <w:r>
+        <w:rPr>
+          <w:rFonts w:ascii="Segoe UI" w:hAnsi="Segoe UI" w:cs="Segoe UI"/>
+          <w:b/>
+          <w:bCs/>
+          <w:sz w:val="18"/>
+          <w:szCs w:val="18"/>
+          <w:lang w:val="es-CO"/>
+        </w:rPr>
+        <w:t>}</w:t>
       </w:r>
     </w:p>
     <w:p>
@@ -7620,6 +7949,7 @@
         </w:rPr>
         <w:tab/>
       </w:r>
+      <w:proofErr w:type="gramStart"/>
       <w:r>
         <w:rPr>
           <w:rFonts w:ascii="Segoe UI" w:hAnsi="Segoe UI" w:cs="Segoe UI"/>
@@ -7641,9 +7971,9 @@
           <w:szCs w:val="18"/>
           <w:lang w:val="es-CO"/>
         </w:rPr>
-        <w:t>job_title.title</w:t>
-      </w:r>
-      <w:proofErr w:type="spellEnd"/>
+        <w:t>job</w:t>
+      </w:r>
+      <w:proofErr w:type="gramEnd"/>
       <w:r>
         <w:rPr>
           <w:rFonts w:ascii="Segoe UI" w:hAnsi="Segoe UI" w:cs="Segoe UI"/>
@@ -7653,27 +7983,62 @@
           <w:szCs w:val="18"/>
           <w:lang w:val="es-CO"/>
         </w:rPr>
-        <w:t>() }}</w:t>
-      </w:r>
-    </w:p>
-    <w:p>
-      <w:pPr>
-        <w:pStyle w:val="Textoindependiente"/>
-        <w:spacing w:before="4"/>
-        <w:rPr>
-          <w:rFonts w:ascii="Segoe UI" w:hAnsi="Segoe UI" w:cs="Segoe UI"/>
-          <w:sz w:val="18"/>
-          <w:szCs w:val="18"/>
-        </w:rPr>
-      </w:pPr>
+        <w:t>_</w:t>
+      </w:r>
+      <w:proofErr w:type="gramStart"/>
+      <w:r>
+        <w:rPr>
+          <w:rFonts w:ascii="Segoe UI" w:hAnsi="Segoe UI" w:cs="Segoe UI"/>
+          <w:b/>
+          <w:bCs/>
+          <w:sz w:val="18"/>
+          <w:szCs w:val="18"/>
+          <w:lang w:val="es-CO"/>
+        </w:rPr>
+        <w:t>title.title</w:t>
+      </w:r>
+      <w:proofErr w:type="spellEnd"/>
+      <w:proofErr w:type="gramEnd"/>
+      <w:r>
+        <w:rPr>
+          <w:rFonts w:ascii="Segoe UI" w:hAnsi="Segoe UI" w:cs="Segoe UI"/>
+          <w:b/>
+          <w:bCs/>
+          <w:sz w:val="18"/>
+          <w:szCs w:val="18"/>
+          <w:lang w:val="es-CO"/>
+        </w:rPr>
+        <w:t>(</w:t>
+      </w:r>
+      <w:proofErr w:type="gramStart"/>
+      <w:r>
+        <w:rPr>
+          <w:rFonts w:ascii="Segoe UI" w:hAnsi="Segoe UI" w:cs="Segoe UI"/>
+          <w:b/>
+          <w:bCs/>
+          <w:sz w:val="18"/>
+          <w:szCs w:val="18"/>
+          <w:lang w:val="es-CO"/>
+        </w:rPr>
+        <w:t>) }</w:t>
+      </w:r>
+      <w:proofErr w:type="gramEnd"/>
+      <w:r>
+        <w:rPr>
+          <w:rFonts w:ascii="Segoe UI" w:hAnsi="Segoe UI" w:cs="Segoe UI"/>
+          <w:b/>
+          <w:bCs/>
+          <w:sz w:val="18"/>
+          <w:szCs w:val="18"/>
+          <w:lang w:val="es-CO"/>
+        </w:rPr>
+        <w:t>}</w:t>
+      </w:r>
     </w:p>
     <w:sectPr>
-      <w:headerReference w:type="even" r:id="rId13"/>
-      <w:headerReference w:type="default" r:id="rId14"/>
-      <w:footerReference w:type="even" r:id="rId15"/>
-      <w:footerReference w:type="default" r:id="rId16"/>
-      <w:headerReference w:type="first" r:id="rId17"/>
-      <w:footerReference w:type="first" r:id="rId18"/>
+      <w:footerReference w:type="default" r:id="rId13"/>
+      <w:headerReference w:type="first" r:id="rId14"/>
+      <w:footerReference w:type="first" r:id="rId15"/>
       <w:pgSz w:w="12240" w:h="15840" w:code="1"/>
       <w:pgMar w:top="1440" w:right="1041" w:bottom="1440" w:left="1134" w:header="708" w:footer="708" w:gutter="0"/>
       <w:cols w:space="708"/>
@@ -7708,6 +8073,83 @@
   <w:p>
     <w:pPr>
       <w:pStyle w:val="Piedepgina"/>
+      <w:rPr>
+        <w:noProof/>
+      </w:rPr>
+    </w:pPr>
+    <w:r>
+      <w:rPr>
+        <w:noProof/>
+      </w:rPr>
+      <w:drawing>
+        <wp:anchor distT="0" distB="0" distL="114300" distR="114300" simplePos="0" relativeHeight="251661312" behindDoc="1" locked="0" layoutInCell="1" allowOverlap="1" wp14:anchorId="15AA3E31" wp14:editId="3473B791">
+          <wp:simplePos x="0" y="0"/>
+          <wp:positionH relativeFrom="page">
+            <wp:posOffset>0</wp:posOffset>
+          </wp:positionH>
+          <wp:positionV relativeFrom="paragraph">
+            <wp:posOffset>-85725</wp:posOffset>
+          </wp:positionV>
+          <wp:extent cx="7772400" cy="734060"/>
+          <wp:effectExtent l="0" t="0" r="0" b="8890"/>
+          <wp:wrapNone/>
+          <wp:docPr id="1281173091" name="Imagen 1"/>
+          <wp:cNvGraphicFramePr>
+            <a:graphicFrameLocks xmlns:a="http://schemas.openxmlformats.org/drawingml/2006/main" noChangeAspect="1"/>
+          </wp:cNvGraphicFramePr>
+          <a:graphic xmlns:a="http://schemas.openxmlformats.org/drawingml/2006/main">
+            <a:graphicData uri="http://schemas.openxmlformats.org/drawingml/2006/picture">
+              <pic:pic xmlns:pic="http://schemas.openxmlformats.org/drawingml/2006/picture">
+                <pic:nvPicPr>
+                  <pic:cNvPr id="1920093933" name="Imagen 1"/>
+                  <pic:cNvPicPr/>
+                </pic:nvPicPr>
+                <pic:blipFill rotWithShape="1">
+                  <a:blip r:embed="rId1">
+                    <a:extLst>
+                      <a:ext uri="{28A0092B-C50C-407E-A947-70E740481C1C}">
+                        <a14:useLocalDpi xmlns:a14="http://schemas.microsoft.com/office/drawing/2010/main" val="0"/>
+                      </a:ext>
+                    </a:extLst>
+                  </a:blip>
+                  <a:srcRect t="92695"/>
+                  <a:stretch>
+                    <a:fillRect/>
+                  </a:stretch>
+                </pic:blipFill>
+                <pic:spPr bwMode="auto">
+                  <a:xfrm>
+                    <a:off x="0" y="0"/>
+                    <a:ext cx="7772400" cy="734060"/>
+                  </a:xfrm>
+                  <a:prstGeom prst="rect">
+                    <a:avLst/>
+                  </a:prstGeom>
+                  <a:ln>
+                    <a:noFill/>
+                  </a:ln>
+                  <a:extLst>
+                    <a:ext uri="{53640926-AAD7-44D8-BBD7-CCE9431645EC}">
+                      <a14:shadowObscured xmlns:a14="http://schemas.microsoft.com/office/drawing/2010/main"/>
+                    </a:ext>
+                  </a:extLst>
+                </pic:spPr>
+              </pic:pic>
+            </a:graphicData>
+          </a:graphic>
+          <wp14:sizeRelH relativeFrom="margin">
+            <wp14:pctWidth>0</wp14:pctWidth>
+          </wp14:sizeRelH>
+          <wp14:sizeRelV relativeFrom="margin">
+            <wp14:pctHeight>0</wp14:pctHeight>
+          </wp14:sizeRelV>
+        </wp:anchor>
+      </w:drawing>
+    </w:r>
+  </w:p>
+  <w:p>
+    <w:pPr>
+      <w:pStyle w:val="Piedepgina"/>
     </w:pPr>
   </w:p>
 </w:ftr>
@@ -7718,17 +8160,97 @@
   <w:p>
     <w:pPr>
       <w:pStyle w:val="Piedepgina"/>
+      <w:tabs>
+        <w:tab w:val="clear" w:pos="4419"/>
+        <w:tab w:val="clear" w:pos="8838"/>
+        <w:tab w:val="left" w:pos="2760"/>
+      </w:tabs>
+      <w:rPr>
+        <w:noProof/>
+      </w:rPr>
     </w:pPr>
+    <w:r>
+      <w:rPr>
+        <w:noProof/>
+      </w:rPr>
+      <w:drawing>
+        <wp:anchor distT="0" distB="0" distL="114300" distR="114300" simplePos="0" relativeHeight="251659264" behindDoc="1" locked="0" layoutInCell="1" allowOverlap="1" wp14:anchorId="50083F9D" wp14:editId="5468E5D3">
+          <wp:simplePos x="0" y="0"/>
+          <wp:positionH relativeFrom="page">
+            <wp:posOffset>0</wp:posOffset>
+          </wp:positionH>
+          <wp:positionV relativeFrom="paragraph">
+            <wp:posOffset>-86995</wp:posOffset>
+          </wp:positionV>
+          <wp:extent cx="7772400" cy="734060"/>
+          <wp:effectExtent l="0" t="0" r="0" b="8890"/>
+          <wp:wrapNone/>
+          <wp:docPr id="1920093933" name="Imagen 1"/>
+          <wp:cNvGraphicFramePr>
+            <a:graphicFrameLocks xmlns:a="http://schemas.openxmlformats.org/drawingml/2006/main" noChangeAspect="1"/>
+          </wp:cNvGraphicFramePr>
+          <a:graphic xmlns:a="http://schemas.openxmlformats.org/drawingml/2006/main">
+            <a:graphicData uri="http://schemas.openxmlformats.org/drawingml/2006/picture">
+              <pic:pic xmlns:pic="http://schemas.openxmlformats.org/drawingml/2006/picture">
+                <pic:nvPicPr>
+                  <pic:cNvPr id="1920093933" name="Imagen 1"/>
+                  <pic:cNvPicPr/>
+                </pic:nvPicPr>
+                <pic:blipFill rotWithShape="1">
+                  <a:blip r:embed="rId1">
+                    <a:extLst>
+                      <a:ext uri="{28A0092B-C50C-407E-A947-70E740481C1C}">
+                        <a14:useLocalDpi xmlns:a14="http://schemas.microsoft.com/office/drawing/2010/main" val="0"/>
+                      </a:ext>
+                    </a:extLst>
+                  </a:blip>
+                  <a:srcRect t="92695"/>
+                  <a:stretch>
+                    <a:fillRect/>
+                  </a:stretch>
+                </pic:blipFill>
+                <pic:spPr bwMode="auto">
+                  <a:xfrm>
+                    <a:off x="0" y="0"/>
+                    <a:ext cx="7772400" cy="734060"/>
+                  </a:xfrm>
+                  <a:prstGeom prst="rect">
+                    <a:avLst/>
+                  </a:prstGeom>
+                  <a:ln>
+                    <a:noFill/>
+                  </a:ln>
+                  <a:extLst>
+                    <a:ext uri="{53640926-AAD7-44D8-BBD7-CCE9431645EC}">
+                      <a14:shadowObscured xmlns:a14="http://schemas.microsoft.com/office/drawing/2010/main"/>
+                    </a:ext>
+                  </a:extLst>
+                </pic:spPr>
+              </pic:pic>
+            </a:graphicData>
+          </a:graphic>
+          <wp14:sizeRelH relativeFrom="margin">
+            <wp14:pctWidth>0</wp14:pctWidth>
+          </wp14:sizeRelH>
+          <wp14:sizeRelV relativeFrom="margin">
+            <wp14:pctHeight>0</wp14:pctHeight>
+          </wp14:sizeRelV>
+        </wp:anchor>
+      </w:drawing>
+    </w:r>
   </w:p>
-</w:ftr>
-</file>
-
-<file path=word/footer3.xml><?xml version="1.0" encoding="utf-8"?>
-<w:ftr xmlns:wpc="http://schemas.microsoft.com/office/word/2010/wordprocessingCanvas" xmlns:cx="http://schemas.microsoft.com/office/drawing/2014/chartex" xmlns:cx1="http://schemas.microsoft.com/office/drawing/2015/9/8/chartex" xmlns:cx2="http://schemas.microsoft.com/office/drawing/2015/10/21/chartex" xmlns:cx3="http://schemas.microsoft.com/office/drawing/2016/5/9/chartex" xmlns:cx4="http://schemas.microsoft.com/office/drawing/2016/5/10/chartex" xmlns:cx5="http://schemas.microsoft.com/office/drawing/2016/5/11/chartex" xmlns:cx6="http://schemas.microsoft.com/office/drawing/2016/5/12/chartex" xmlns:cx7="http://schemas.microsoft.com/office/drawing/2016/5/13/chartex" xmlns:cx8="http://schemas.microsoft.com/office/drawing/2016/5/14/chartex" xmlns:mc="http://schemas.openxmlformats.org/markup-compatibility/2006" xmlns:aink="http://schemas.microsoft.com/office/drawing/2016/ink" xmlns:am3d="http://schemas.microsoft.com/office/drawing/2017/model3d" xmlns:o="urn:schemas-microsoft-com:office:office" xmlns:oel="http://schemas.microsoft.com/office/2019/extlst" xmlns:r="http://schemas.openxmlformats.org/officeDocument/2006/relationships" xmlns:m="http://schemas.openxmlformats.org/officeDocument/2006/math" xmlns:v="urn:schemas-microsoft-com:vml" xmlns:wp14="http://schemas.microsoft.com/office/word/2010/wordprocessingDrawing" xmlns:wp="http://schemas.openxmlformats.org/drawingml/2006/wordprocessingDrawing" xmlns:w10="urn:schemas-microsoft-com:office:word" xmlns:w="http://schemas.openxmlformats.org/wordprocessingml/2006/main" xmlns:w14="http://schemas.microsoft.com/office/word/2010/wordml" xmlns:w15="http://schemas.microsoft.com/office/word/2012/wordml" xmlns:w16cex="http://schemas.microsoft.com/office/word/2018/wordml/cex" xmlns:w16cid="http://schemas.microsoft.com/office/word/2016/wordml/cid" xmlns:w16="http://schemas.microsoft.com/office/word/2018/wordml" xmlns:w16du="http://schemas.microsoft.com/office/word/2023/wordml/word16du" xmlns:w16sdtdh="http://schemas.microsoft.com/office/word/2020/wordml/sdtdatahash" xmlns:w16sdtfl="http://schemas.microsoft.com/office/word/2024/wordml/sdtformatlock" xmlns:w16se="http://schemas.microsoft.com/office/word/2015/wordml/symex" xmlns:wpg="http://schemas.microsoft.com/office/word/2010/wordprocessingGroup" xmlns:wpi="http://schemas.microsoft.com/office/word/2010/wordprocessingInk" xmlns:wne="http://schemas.microsoft.com/office/word/2006/wordml" xmlns:wps="http://schemas.microsoft.com/office/word/2010/wordprocessingShape" mc:Ignorable="w14 w15 w16se w16cid w16 w16cex w16sdtdh w16sdtfl w16du wp14">
   <w:p>
     <w:pPr>
       <w:pStyle w:val="Piedepgina"/>
+      <w:tabs>
+        <w:tab w:val="clear" w:pos="4419"/>
+        <w:tab w:val="clear" w:pos="8838"/>
+        <w:tab w:val="left" w:pos="2760"/>
+      </w:tabs>
     </w:pPr>
+    <w:r>
+      <w:tab/>
+    </w:r>
   </w:p>
 </w:ftr>
 </file>
@@ -7753,26 +8275,6 @@
 </file>
 
 <file path=word/header1.xml><?xml version="1.0" encoding="utf-8"?>
-<w:hdr xmlns:wpc="http://schemas.microsoft.com/office/word/2010/wordprocessingCanvas" xmlns:cx="http://schemas.microsoft.com/office/drawing/2014/chartex" xmlns:cx1="http://schemas.microsoft.com/office/drawing/2015/9/8/chartex" xmlns:cx2="http://schemas.microsoft.com/office/drawing/2015/10/21/chartex" xmlns:cx3="http://schemas.microsoft.com/office/drawing/2016/5/9/chartex" xmlns:cx4="http://schemas.microsoft.com/office/drawing/2016/5/10/chartex" xmlns:cx5="http://schemas.microsoft.com/office/drawing/2016/5/11/chartex" xmlns:cx6="http://schemas.microsoft.com/office/drawing/2016/5/12/chartex" xmlns:cx7="http://schemas.microsoft.com/office/drawing/2016/5/13/chartex" xmlns:cx8="http://schemas.microsoft.com/office/drawing/2016/5/14/chartex" xmlns:mc="http://schemas.openxmlformats.org/markup-compatibility/2006" xmlns:aink="http://schemas.microsoft.com/office/drawing/2016/ink" xmlns:am3d="http://schemas.microsoft.com/office/drawing/2017/model3d" xmlns:o="urn:schemas-microsoft-com:office:office" xmlns:oel="http://schemas.microsoft.com/office/2019/extlst" xmlns:r="http://schemas.openxmlformats.org/officeDocument/2006/relationships" xmlns:m="http://schemas.openxmlformats.org/officeDocument/2006/math" xmlns:v="urn:schemas-microsoft-com:vml" xmlns:wp14="http://schemas.microsoft.com/office/word/2010/wordprocessingDrawing" xmlns:wp="http://schemas.openxmlformats.org/drawingml/2006/wordprocessingDrawing" xmlns:w10="urn:schemas-microsoft-com:office:word" xmlns:w="http://schemas.openxmlformats.org/wordprocessingml/2006/main" xmlns:w14="http://schemas.microsoft.com/office/word/2010/wordml" xmlns:w15="http://schemas.microsoft.com/office/word/2012/wordml" xmlns:w16cex="http://schemas.microsoft.com/office/word/2018/wordml/cex" xmlns:w16cid="http://schemas.microsoft.com/office/word/2016/wordml/cid" xmlns:w16="http://schemas.microsoft.com/office/word/2018/wordml" xmlns:w16du="http://schemas.microsoft.com/office/word/2023/wordml/word16du" xmlns:w16sdtdh="http://schemas.microsoft.com/office/word/2020/wordml/sdtdatahash" xmlns:w16sdtfl="http://schemas.microsoft.com/office/word/2024/wordml/sdtformatlock" xmlns:w16se="http://schemas.microsoft.com/office/word/2015/wordml/symex" xmlns:wpg="http://schemas.microsoft.com/office/word/2010/wordprocessingGroup" xmlns:wpi="http://schemas.microsoft.com/office/word/2010/wordprocessingInk" xmlns:wne="http://schemas.microsoft.com/office/word/2006/wordml" xmlns:wps="http://schemas.microsoft.com/office/word/2010/wordprocessingShape" mc:Ignorable="w14 w15 w16se w16cid w16 w16cex w16sdtdh w16sdtfl w16du wp14">
-  <w:p>
-    <w:pPr>
-      <w:pStyle w:val="Encabezado"/>
-    </w:pPr>
-  </w:p>
-</w:hdr>
-</file>
-
-<file path=word/header2.xml><?xml version="1.0" encoding="utf-8"?>
-<w:hdr xmlns:wpc="http://schemas.microsoft.com/office/word/2010/wordprocessingCanvas" xmlns:cx="http://schemas.microsoft.com/office/drawing/2014/chartex" xmlns:cx1="http://schemas.microsoft.com/office/drawing/2015/9/8/chartex" xmlns:cx2="http://schemas.microsoft.com/office/drawing/2015/10/21/chartex" xmlns:cx3="http://schemas.microsoft.com/office/drawing/2016/5/9/chartex" xmlns:cx4="http://schemas.microsoft.com/office/drawing/2016/5/10/chartex" xmlns:cx5="http://schemas.microsoft.com/office/drawing/2016/5/11/chartex" xmlns:cx6="http://schemas.microsoft.com/office/drawing/2016/5/12/chartex" xmlns:cx7="http://schemas.microsoft.com/office/drawing/2016/5/13/chartex" xmlns:cx8="http://schemas.microsoft.com/office/drawing/2016/5/14/chartex" xmlns:mc="http://schemas.openxmlformats.org/markup-compatibility/2006" xmlns:aink="http://schemas.microsoft.com/office/drawing/2016/ink" xmlns:am3d="http://schemas.microsoft.com/office/drawing/2017/model3d" xmlns:o="urn:schemas-microsoft-com:office:office" xmlns:oel="http://schemas.microsoft.com/office/2019/extlst" xmlns:r="http://schemas.openxmlformats.org/officeDocument/2006/relationships" xmlns:m="http://schemas.openxmlformats.org/officeDocument/2006/math" xmlns:v="urn:schemas-microsoft-com:vml" xmlns:wp14="http://schemas.microsoft.com/office/word/2010/wordprocessingDrawing" xmlns:wp="http://schemas.openxmlformats.org/drawingml/2006/wordprocessingDrawing" xmlns:w10="urn:schemas-microsoft-com:office:word" xmlns:w="http://schemas.openxmlformats.org/wordprocessingml/2006/main" xmlns:w14="http://schemas.microsoft.com/office/word/2010/wordml" xmlns:w15="http://schemas.microsoft.com/office/word/2012/wordml" xmlns:w16cex="http://schemas.microsoft.com/office/word/2018/wordml/cex" xmlns:w16cid="http://schemas.microsoft.com/office/word/2016/wordml/cid" xmlns:w16="http://schemas.microsoft.com/office/word/2018/wordml" xmlns:w16du="http://schemas.microsoft.com/office/word/2023/wordml/word16du" xmlns:w16sdtdh="http://schemas.microsoft.com/office/word/2020/wordml/sdtdatahash" xmlns:w16sdtfl="http://schemas.microsoft.com/office/word/2024/wordml/sdtformatlock" xmlns:w16se="http://schemas.microsoft.com/office/word/2015/wordml/symex" xmlns:wpg="http://schemas.microsoft.com/office/word/2010/wordprocessingGroup" xmlns:wpi="http://schemas.microsoft.com/office/word/2010/wordprocessingInk" xmlns:wne="http://schemas.microsoft.com/office/word/2006/wordml" xmlns:wps="http://schemas.microsoft.com/office/word/2010/wordprocessingShape" mc:Ignorable="w14 w15 w16se w16cid w16 w16cex w16sdtdh w16sdtfl w16du wp14">
-  <w:p>
-    <w:pPr>
-      <w:pStyle w:val="Encabezado"/>
-    </w:pPr>
-  </w:p>
-</w:hdr>
-</file>
-
-<file path=word/header3.xml><?xml version="1.0" encoding="utf-8"?>
 <w:hdr xmlns:wpc="http://schemas.microsoft.com/office/word/2010/wordprocessingCanvas" xmlns:cx="http://schemas.microsoft.com/office/drawing/2014/chartex" xmlns:cx1="http://schemas.microsoft.com/office/drawing/2015/9/8/chartex" xmlns:cx2="http://schemas.microsoft.com/office/drawing/2015/10/21/chartex" xmlns:cx3="http://schemas.microsoft.com/office/drawing/2016/5/9/chartex" xmlns:cx4="http://schemas.microsoft.com/office/drawing/2016/5/10/chartex" xmlns:cx5="http://schemas.microsoft.com/office/drawing/2016/5/11/chartex" xmlns:cx6="http://schemas.microsoft.com/office/drawing/2016/5/12/chartex" xmlns:cx7="http://schemas.microsoft.com/office/drawing/2016/5/13/chartex" xmlns:cx8="http://schemas.microsoft.com/office/drawing/2016/5/14/chartex" xmlns:mc="http://schemas.openxmlformats.org/markup-compatibility/2006" xmlns:aink="http://schemas.microsoft.com/office/drawing/2016/ink" xmlns:am3d="http://schemas.microsoft.com/office/drawing/2017/model3d" xmlns:o="urn:schemas-microsoft-com:office:office" xmlns:oel="http://schemas.microsoft.com/office/2019/extlst" xmlns:r="http://schemas.openxmlformats.org/officeDocument/2006/relationships" xmlns:m="http://schemas.openxmlformats.org/officeDocument/2006/math" xmlns:v="urn:schemas-microsoft-com:vml" xmlns:wp14="http://schemas.microsoft.com/office/word/2010/wordprocessingDrawing" xmlns:wp="http://schemas.openxmlformats.org/drawingml/2006/wordprocessingDrawing" xmlns:w10="urn:schemas-microsoft-com:office:word" xmlns:w="http://schemas.openxmlformats.org/wordprocessingml/2006/main" xmlns:w14="http://schemas.microsoft.com/office/word/2010/wordml" xmlns:w15="http://schemas.microsoft.com/office/word/2012/wordml" xmlns:w16cex="http://schemas.microsoft.com/office/word/2018/wordml/cex" xmlns:w16cid="http://schemas.microsoft.com/office/word/2016/wordml/cid" xmlns:w16="http://schemas.microsoft.com/office/word/2018/wordml" xmlns:w16du="http://schemas.microsoft.com/office/word/2023/wordml/word16du" xmlns:w16sdtdh="http://schemas.microsoft.com/office/word/2020/wordml/sdtdatahash" xmlns:w16sdtfl="http://schemas.microsoft.com/office/word/2024/wordml/sdtformatlock" xmlns:w16se="http://schemas.microsoft.com/office/word/2015/wordml/symex" xmlns:wpg="http://schemas.microsoft.com/office/word/2010/wordprocessingGroup" xmlns:wpi="http://schemas.microsoft.com/office/word/2010/wordprocessingInk" xmlns:wne="http://schemas.microsoft.com/office/word/2006/wordml" xmlns:wps="http://schemas.microsoft.com/office/word/2010/wordprocessingShape" mc:Ignorable="w14 w15 w16se w16cid w16 w16cex w16sdtdh w16sdtfl w16du wp14">
   <w:tbl>
     <w:tblPr>
@@ -8197,6 +8699,7 @@
             <w:t>{{</w:t>
           </w:r>
           <w:proofErr w:type="spellStart"/>
+          <w:proofErr w:type="gramStart"/>
           <w:r>
             <w:rPr>
               <w:rFonts w:ascii="Segoe UI" w:eastAsia="Segoe UI" w:hAnsi="Segoe UI" w:cs="Segoe UI"/>
@@ -8218,6 +8721,7 @@
             <w:t>.title</w:t>
           </w:r>
           <w:proofErr w:type="spellEnd"/>
+          <w:proofErr w:type="gramEnd"/>
           <w:r>
             <w:rPr>
               <w:rFonts w:ascii="Segoe UI" w:eastAsia="Segoe UI" w:hAnsi="Segoe UI" w:cs="Segoe UI"/>
@@ -8260,6 +8764,7 @@
             <w:t>{{</w:t>
           </w:r>
           <w:proofErr w:type="spellStart"/>
+          <w:proofErr w:type="gramStart"/>
           <w:r>
             <w:rPr>
               <w:rFonts w:ascii="Segoe UI" w:eastAsia="Segoe UI" w:hAnsi="Segoe UI" w:cs="Segoe UI"/>
@@ -8281,6 +8786,7 @@
             <w:t>.upper</w:t>
           </w:r>
           <w:proofErr w:type="spellEnd"/>
+          <w:proofErr w:type="gramEnd"/>
           <w:r>
             <w:rPr>
               <w:rFonts w:ascii="Segoe UI" w:eastAsia="Segoe UI" w:hAnsi="Segoe UI" w:cs="Segoe UI"/>
@@ -8319,6 +8825,7 @@
             <w:t>{{</w:t>
           </w:r>
           <w:proofErr w:type="spellStart"/>
+          <w:proofErr w:type="gramStart"/>
           <w:r>
             <w:rPr>
               <w:rFonts w:ascii="Segoe UI" w:hAnsi="Segoe UI" w:cs="Segoe UI"/>
@@ -8338,6 +8845,7 @@
             <w:t>.upper</w:t>
           </w:r>
           <w:proofErr w:type="spellEnd"/>
+          <w:proofErr w:type="gramEnd"/>
           <w:r>
             <w:rPr>
               <w:rFonts w:ascii="Segoe UI" w:eastAsia="Segoe UI" w:hAnsi="Segoe UI" w:cs="Segoe UI"/>

</xml_diff>